<commit_message>
Revise chapter 1 formatting and technology section
</commit_message>
<xml_diff>
--- a/BaoCao/Tuan_02_Chuong_1/Chuong_1_Bao_cao_DATN_TranHuyHoang_2022603587_co_bia_muc_luc_openai_gpt.docx
+++ b/BaoCao/Tuan_02_Chuong_1/Chuong_1_Bao_cao_DATN_TranHuyHoang_2022603587_co_bia_muc_luc_openai_gpt.docx
@@ -167,10 +167,11 @@
       <w:r>
         <w:fldChar w:fldCharType="separate"/>
       </w:r>
-      <w:hyperlink w:anchor="_Toc228292395" w:history="1">
+      <w:hyperlink w:anchor="_Toc229000266" w:history="1">
         <w:r>
           <w:rPr>
             <w:rStyle w:val="Hyperlink"/>
+            <w:rFonts w:cs="Times New Roman"/>
             <w:noProof/>
           </w:rPr>
           <w:t>CHƯƠNG 1: GIỚI THIỆU TỔNG QUAN</w:t>
@@ -194,7 +195,81 @@
             <w:noProof/>
             <w:webHidden/>
           </w:rPr>
-          <w:instrText xml:space="preserve"> PAGEREF _Toc228292395 \h </w:instrText>
+          <w:instrText xml:space="preserve"> PAGEREF _Toc229000266 \h </w:instrText>
+        </w:r>
+        <w:r>
+          <w:rPr>
+            <w:noProof/>
+            <w:webHidden/>
+          </w:rPr>
+        </w:r>
+        <w:r>
+          <w:rPr>
+            <w:noProof/>
+            <w:webHidden/>
+          </w:rPr>
+          <w:fldChar w:fldCharType="separate"/>
+        </w:r>
+        <w:r>
+          <w:rPr>
+            <w:noProof/>
+            <w:webHidden/>
+          </w:rPr>
+          <w:t>3</w:t>
+        </w:r>
+        <w:r>
+          <w:rPr>
+            <w:noProof/>
+            <w:webHidden/>
+          </w:rPr>
+          <w:fldChar w:fldCharType="end"/>
+        </w:r>
+      </w:hyperlink>
+    </w:p>
+    <w:p>
+      <w:pPr>
+        <w:pStyle w:val="TOC2"/>
+        <w:tabs>
+          <w:tab w:val="right" w:leader="dot" w:pos="8778"/>
+        </w:tabs>
+        <w:rPr>
+          <w:rFonts w:asciiTheme="minorHAnsi" w:eastAsiaTheme="minorEastAsia" w:hAnsiTheme="minorHAnsi"/>
+          <w:noProof/>
+          <w:kern w:val="2"/>
+          <w:sz w:val="24"/>
+          <w:szCs w:val="24"/>
+          <w14:ligatures w14:val="standardContextual"/>
+        </w:rPr>
+      </w:pPr>
+      <w:hyperlink w:anchor="_Toc229000267" w:history="1">
+        <w:r>
+          <w:rPr>
+            <w:rStyle w:val="Hyperlink"/>
+            <w:rFonts w:cs="Times New Roman"/>
+            <w:noProof/>
+          </w:rPr>
+          <w:t>1.1. Giới thiệu chung</w:t>
+        </w:r>
+        <w:r>
+          <w:rPr>
+            <w:noProof/>
+            <w:webHidden/>
+          </w:rPr>
+          <w:tab/>
+        </w:r>
+        <w:r>
+          <w:rPr>
+            <w:noProof/>
+            <w:webHidden/>
+          </w:rPr>
+          <w:fldChar w:fldCharType="begin"/>
+        </w:r>
+        <w:r>
+          <w:rPr>
+            <w:noProof/>
+            <w:webHidden/>
+          </w:rPr>
+          <w:instrText xml:space="preserve"> PAGEREF _Toc229000267 \h </w:instrText>
         </w:r>
         <w:r>
           <w:rPr>
@@ -240,13 +315,14 @@
           <w14:ligatures w14:val="standardContextual"/>
         </w:rPr>
       </w:pPr>
-      <w:hyperlink w:anchor="_Toc228292396" w:history="1">
+      <w:hyperlink w:anchor="_Toc229000268" w:history="1">
         <w:r>
           <w:rPr>
             <w:rStyle w:val="Hyperlink"/>
-            <w:noProof/>
-          </w:rPr>
-          <w:t>1.1. Giới thiệu chung</w:t>
+            <w:rFonts w:cs="Times New Roman"/>
+            <w:noProof/>
+          </w:rPr>
+          <w:t>1.1.1. Tổng quan về thương mại điện tử</w:t>
         </w:r>
         <w:r>
           <w:rPr>
@@ -267,7 +343,7 @@
             <w:noProof/>
             <w:webHidden/>
           </w:rPr>
-          <w:instrText xml:space="preserve"> PAGEREF _Toc228292396 \h </w:instrText>
+          <w:instrText xml:space="preserve"> PAGEREF _Toc229000268 \h </w:instrText>
         </w:r>
         <w:r>
           <w:rPr>
@@ -313,13 +389,14 @@
           <w14:ligatures w14:val="standardContextual"/>
         </w:rPr>
       </w:pPr>
-      <w:hyperlink w:anchor="_Toc228292397" w:history="1">
+      <w:hyperlink w:anchor="_Toc229000269" w:history="1">
         <w:r>
           <w:rPr>
             <w:rStyle w:val="Hyperlink"/>
-            <w:noProof/>
-          </w:rPr>
-          <w:t>1.1.1. Tổng quan về thương mại điện tử</w:t>
+            <w:rFonts w:cs="Times New Roman"/>
+            <w:noProof/>
+          </w:rPr>
+          <w:t>1.1.2. Đặc điểm của thương mại điện tử trong lĩnh vực máy tính và linh kiện</w:t>
         </w:r>
         <w:r>
           <w:rPr>
@@ -340,7 +417,7 @@
             <w:noProof/>
             <w:webHidden/>
           </w:rPr>
-          <w:instrText xml:space="preserve"> PAGEREF _Toc228292397 \h </w:instrText>
+          <w:instrText xml:space="preserve"> PAGEREF _Toc229000269 \h </w:instrText>
         </w:r>
         <w:r>
           <w:rPr>
@@ -360,7 +437,7 @@
             <w:noProof/>
             <w:webHidden/>
           </w:rPr>
-          <w:t>3</w:t>
+          <w:t>4</w:t>
         </w:r>
         <w:r>
           <w:rPr>
@@ -386,13 +463,14 @@
           <w14:ligatures w14:val="standardContextual"/>
         </w:rPr>
       </w:pPr>
-      <w:hyperlink w:anchor="_Toc228292398" w:history="1">
+      <w:hyperlink w:anchor="_Toc229000270" w:history="1">
         <w:r>
           <w:rPr>
             <w:rStyle w:val="Hyperlink"/>
-            <w:noProof/>
-          </w:rPr>
-          <w:t>1.1.2. Đặc điểm của thương mại điện tử trong lĩnh vực máy tính và linh kiện</w:t>
+            <w:rFonts w:cs="Times New Roman"/>
+            <w:noProof/>
+          </w:rPr>
+          <w:t>1.1.3. Thuận lợi khi ứng dụng thương mại điện tử</w:t>
         </w:r>
         <w:r>
           <w:rPr>
@@ -413,7 +491,7 @@
             <w:noProof/>
             <w:webHidden/>
           </w:rPr>
-          <w:instrText xml:space="preserve"> PAGEREF _Toc228292398 \h </w:instrText>
+          <w:instrText xml:space="preserve"> PAGEREF _Toc229000270 \h </w:instrText>
         </w:r>
         <w:r>
           <w:rPr>
@@ -433,7 +511,7 @@
             <w:noProof/>
             <w:webHidden/>
           </w:rPr>
-          <w:t>4</w:t>
+          <w:t>5</w:t>
         </w:r>
         <w:r>
           <w:rPr>
@@ -459,13 +537,14 @@
           <w14:ligatures w14:val="standardContextual"/>
         </w:rPr>
       </w:pPr>
-      <w:hyperlink w:anchor="_Toc228292399" w:history="1">
+      <w:hyperlink w:anchor="_Toc229000271" w:history="1">
         <w:r>
           <w:rPr>
             <w:rStyle w:val="Hyperlink"/>
-            <w:noProof/>
-          </w:rPr>
-          <w:t>1.1.3. Thuận lợi khi ứng dụng thương mại điện tử</w:t>
+            <w:rFonts w:cs="Times New Roman"/>
+            <w:noProof/>
+          </w:rPr>
+          <w:t>1.1.4. Khó khăn và thách thức khi triển khai thương mại điện tử</w:t>
         </w:r>
         <w:r>
           <w:rPr>
@@ -486,7 +565,7 @@
             <w:noProof/>
             <w:webHidden/>
           </w:rPr>
-          <w:instrText xml:space="preserve"> PAGEREF _Toc228292399 \h </w:instrText>
+          <w:instrText xml:space="preserve"> PAGEREF _Toc229000271 \h </w:instrText>
         </w:r>
         <w:r>
           <w:rPr>
@@ -532,13 +611,14 @@
           <w14:ligatures w14:val="standardContextual"/>
         </w:rPr>
       </w:pPr>
-      <w:hyperlink w:anchor="_Toc228292400" w:history="1">
+      <w:hyperlink w:anchor="_Toc229000272" w:history="1">
         <w:r>
           <w:rPr>
             <w:rStyle w:val="Hyperlink"/>
-            <w:noProof/>
-          </w:rPr>
-          <w:t>1.1.4. Khó khăn và thách thức khi triển khai thương mại điện tử</w:t>
+            <w:rFonts w:cs="Times New Roman"/>
+            <w:noProof/>
+          </w:rPr>
+          <w:t>1.1.5. Giới thiệu về công ty GTech và định hướng xây dựng website</w:t>
         </w:r>
         <w:r>
           <w:rPr>
@@ -559,7 +639,7 @@
             <w:noProof/>
             <w:webHidden/>
           </w:rPr>
-          <w:instrText xml:space="preserve"> PAGEREF _Toc228292400 \h </w:instrText>
+          <w:instrText xml:space="preserve"> PAGEREF _Toc229000272 \h </w:instrText>
         </w:r>
         <w:r>
           <w:rPr>
@@ -579,7 +659,81 @@
             <w:noProof/>
             <w:webHidden/>
           </w:rPr>
-          <w:t>5</w:t>
+          <w:t>6</w:t>
+        </w:r>
+        <w:r>
+          <w:rPr>
+            <w:noProof/>
+            <w:webHidden/>
+          </w:rPr>
+          <w:fldChar w:fldCharType="end"/>
+        </w:r>
+      </w:hyperlink>
+    </w:p>
+    <w:p>
+      <w:pPr>
+        <w:pStyle w:val="TOC2"/>
+        <w:tabs>
+          <w:tab w:val="right" w:leader="dot" w:pos="8778"/>
+        </w:tabs>
+        <w:rPr>
+          <w:rFonts w:asciiTheme="minorHAnsi" w:eastAsiaTheme="minorEastAsia" w:hAnsiTheme="minorHAnsi"/>
+          <w:noProof/>
+          <w:kern w:val="2"/>
+          <w:sz w:val="24"/>
+          <w:szCs w:val="24"/>
+          <w14:ligatures w14:val="standardContextual"/>
+        </w:rPr>
+      </w:pPr>
+      <w:hyperlink w:anchor="_Toc229000273" w:history="1">
+        <w:r>
+          <w:rPr>
+            <w:rStyle w:val="Hyperlink"/>
+            <w:rFonts w:cs="Times New Roman"/>
+            <w:noProof/>
+          </w:rPr>
+          <w:t>1.2. Nghiên cứu hiện trạng và giải quyết vấn đề</w:t>
+        </w:r>
+        <w:r>
+          <w:rPr>
+            <w:noProof/>
+            <w:webHidden/>
+          </w:rPr>
+          <w:tab/>
+        </w:r>
+        <w:r>
+          <w:rPr>
+            <w:noProof/>
+            <w:webHidden/>
+          </w:rPr>
+          <w:fldChar w:fldCharType="begin"/>
+        </w:r>
+        <w:r>
+          <w:rPr>
+            <w:noProof/>
+            <w:webHidden/>
+          </w:rPr>
+          <w:instrText xml:space="preserve"> PAGEREF _Toc229000273 \h </w:instrText>
+        </w:r>
+        <w:r>
+          <w:rPr>
+            <w:noProof/>
+            <w:webHidden/>
+          </w:rPr>
+        </w:r>
+        <w:r>
+          <w:rPr>
+            <w:noProof/>
+            <w:webHidden/>
+          </w:rPr>
+          <w:fldChar w:fldCharType="separate"/>
+        </w:r>
+        <w:r>
+          <w:rPr>
+            <w:noProof/>
+            <w:webHidden/>
+          </w:rPr>
+          <w:t>8</w:t>
         </w:r>
         <w:r>
           <w:rPr>
@@ -605,13 +759,14 @@
           <w14:ligatures w14:val="standardContextual"/>
         </w:rPr>
       </w:pPr>
-      <w:hyperlink w:anchor="_Toc228292401" w:history="1">
+      <w:hyperlink w:anchor="_Toc229000274" w:history="1">
         <w:r>
           <w:rPr>
             <w:rStyle w:val="Hyperlink"/>
-            <w:noProof/>
-          </w:rPr>
-          <w:t>1.1.5. Giới thiệu về công ty GTech và định hướng xây dựng website</w:t>
+            <w:rFonts w:cs="Times New Roman"/>
+            <w:noProof/>
+          </w:rPr>
+          <w:t>1.2.1. Hiện trạng hoạt động kinh doanh của GTech</w:t>
         </w:r>
         <w:r>
           <w:rPr>
@@ -632,7 +787,7 @@
             <w:noProof/>
             <w:webHidden/>
           </w:rPr>
-          <w:instrText xml:space="preserve"> PAGEREF _Toc228292401 \h </w:instrText>
+          <w:instrText xml:space="preserve"> PAGEREF _Toc229000274 \h </w:instrText>
         </w:r>
         <w:r>
           <w:rPr>
@@ -652,7 +807,7 @@
             <w:noProof/>
             <w:webHidden/>
           </w:rPr>
-          <w:t>6</w:t>
+          <w:t>8</w:t>
         </w:r>
         <w:r>
           <w:rPr>
@@ -678,13 +833,14 @@
           <w14:ligatures w14:val="standardContextual"/>
         </w:rPr>
       </w:pPr>
-      <w:hyperlink w:anchor="_Toc228292402" w:history="1">
+      <w:hyperlink w:anchor="_Toc229000275" w:history="1">
         <w:r>
           <w:rPr>
             <w:rStyle w:val="Hyperlink"/>
-            <w:noProof/>
-          </w:rPr>
-          <w:t>1.2. Nghiên cứu hiện trạng và giải quyết vấn đề</w:t>
+            <w:rFonts w:cs="Times New Roman"/>
+            <w:noProof/>
+          </w:rPr>
+          <w:t>1.2.2. Cơ cấu tổ chức liên quan đến hệ thống</w:t>
         </w:r>
         <w:r>
           <w:rPr>
@@ -705,7 +861,7 @@
             <w:noProof/>
             <w:webHidden/>
           </w:rPr>
-          <w:instrText xml:space="preserve"> PAGEREF _Toc228292402 \h </w:instrText>
+          <w:instrText xml:space="preserve"> PAGEREF _Toc229000275 \h </w:instrText>
         </w:r>
         <w:r>
           <w:rPr>
@@ -751,13 +907,14 @@
           <w14:ligatures w14:val="standardContextual"/>
         </w:rPr>
       </w:pPr>
-      <w:hyperlink w:anchor="_Toc228292403" w:history="1">
+      <w:hyperlink w:anchor="_Toc229000276" w:history="1">
         <w:r>
           <w:rPr>
             <w:rStyle w:val="Hyperlink"/>
-            <w:noProof/>
-          </w:rPr>
-          <w:t>1.2.1. Hiện trạng hoạt động kinh doanh của GTech</w:t>
+            <w:rFonts w:cs="Times New Roman"/>
+            <w:noProof/>
+          </w:rPr>
+          <w:t>1.2.3. Mô tả hoạt động của các bộ phận</w:t>
         </w:r>
         <w:r>
           <w:rPr>
@@ -778,7 +935,7 @@
             <w:noProof/>
             <w:webHidden/>
           </w:rPr>
-          <w:instrText xml:space="preserve"> PAGEREF _Toc228292403 \h </w:instrText>
+          <w:instrText xml:space="preserve"> PAGEREF _Toc229000276 \h </w:instrText>
         </w:r>
         <w:r>
           <w:rPr>
@@ -798,7 +955,7 @@
             <w:noProof/>
             <w:webHidden/>
           </w:rPr>
-          <w:t>8</w:t>
+          <w:t>9</w:t>
         </w:r>
         <w:r>
           <w:rPr>
@@ -824,13 +981,14 @@
           <w14:ligatures w14:val="standardContextual"/>
         </w:rPr>
       </w:pPr>
-      <w:hyperlink w:anchor="_Toc228292404" w:history="1">
+      <w:hyperlink w:anchor="_Toc229000277" w:history="1">
         <w:r>
           <w:rPr>
             <w:rStyle w:val="Hyperlink"/>
-            <w:noProof/>
-          </w:rPr>
-          <w:t>1.2.2. Cơ cấu tổ chức liên quan đến hệ thống</w:t>
+            <w:rFonts w:cs="Times New Roman"/>
+            <w:noProof/>
+          </w:rPr>
+          <w:t>1.2.4. Các vấn đề tồn tại</w:t>
         </w:r>
         <w:r>
           <w:rPr>
@@ -851,7 +1009,7 @@
             <w:noProof/>
             <w:webHidden/>
           </w:rPr>
-          <w:instrText xml:space="preserve"> PAGEREF _Toc228292404 \h </w:instrText>
+          <w:instrText xml:space="preserve"> PAGEREF _Toc229000277 \h </w:instrText>
         </w:r>
         <w:r>
           <w:rPr>
@@ -871,7 +1029,7 @@
             <w:noProof/>
             <w:webHidden/>
           </w:rPr>
-          <w:t>8</w:t>
+          <w:t>9</w:t>
         </w:r>
         <w:r>
           <w:rPr>
@@ -897,13 +1055,14 @@
           <w14:ligatures w14:val="standardContextual"/>
         </w:rPr>
       </w:pPr>
-      <w:hyperlink w:anchor="_Toc228292405" w:history="1">
+      <w:hyperlink w:anchor="_Toc229000278" w:history="1">
         <w:r>
           <w:rPr>
             <w:rStyle w:val="Hyperlink"/>
-            <w:noProof/>
-          </w:rPr>
-          <w:t>1.2.3. Mô tả hoạt động của các bộ phận</w:t>
+            <w:rFonts w:cs="Times New Roman"/>
+            <w:noProof/>
+          </w:rPr>
+          <w:t>1.2.5. Định hướng giải quyết</w:t>
         </w:r>
         <w:r>
           <w:rPr>
@@ -924,7 +1083,7 @@
             <w:noProof/>
             <w:webHidden/>
           </w:rPr>
-          <w:instrText xml:space="preserve"> PAGEREF _Toc228292405 \h </w:instrText>
+          <w:instrText xml:space="preserve"> PAGEREF _Toc229000278 \h </w:instrText>
         </w:r>
         <w:r>
           <w:rPr>
@@ -944,7 +1103,7 @@
             <w:noProof/>
             <w:webHidden/>
           </w:rPr>
-          <w:t>9</w:t>
+          <w:t>10</w:t>
         </w:r>
         <w:r>
           <w:rPr>
@@ -970,13 +1129,14 @@
           <w14:ligatures w14:val="standardContextual"/>
         </w:rPr>
       </w:pPr>
-      <w:hyperlink w:anchor="_Toc228292406" w:history="1">
+      <w:hyperlink w:anchor="_Toc229000279" w:history="1">
         <w:r>
           <w:rPr>
             <w:rStyle w:val="Hyperlink"/>
-            <w:noProof/>
-          </w:rPr>
-          <w:t>1.2.4. Các vấn đề tồn tại</w:t>
+            <w:rFonts w:cs="Times New Roman"/>
+            <w:noProof/>
+          </w:rPr>
+          <w:t>1.2.6. Xác định yêu cầu hệ thống</w:t>
         </w:r>
         <w:r>
           <w:rPr>
@@ -997,7 +1157,7 @@
             <w:noProof/>
             <w:webHidden/>
           </w:rPr>
-          <w:instrText xml:space="preserve"> PAGEREF _Toc228292406 \h </w:instrText>
+          <w:instrText xml:space="preserve"> PAGEREF _Toc229000279 \h </w:instrText>
         </w:r>
         <w:r>
           <w:rPr>
@@ -1017,7 +1177,81 @@
             <w:noProof/>
             <w:webHidden/>
           </w:rPr>
-          <w:t>9</w:t>
+          <w:t>11</w:t>
+        </w:r>
+        <w:r>
+          <w:rPr>
+            <w:noProof/>
+            <w:webHidden/>
+          </w:rPr>
+          <w:fldChar w:fldCharType="end"/>
+        </w:r>
+      </w:hyperlink>
+    </w:p>
+    <w:p>
+      <w:pPr>
+        <w:pStyle w:val="TOC2"/>
+        <w:tabs>
+          <w:tab w:val="right" w:leader="dot" w:pos="8778"/>
+        </w:tabs>
+        <w:rPr>
+          <w:rFonts w:asciiTheme="minorHAnsi" w:eastAsiaTheme="minorEastAsia" w:hAnsiTheme="minorHAnsi"/>
+          <w:noProof/>
+          <w:kern w:val="2"/>
+          <w:sz w:val="24"/>
+          <w:szCs w:val="24"/>
+          <w14:ligatures w14:val="standardContextual"/>
+        </w:rPr>
+      </w:pPr>
+      <w:hyperlink w:anchor="_Toc229000280" w:history="1">
+        <w:r>
+          <w:rPr>
+            <w:rStyle w:val="Hyperlink"/>
+            <w:rFonts w:cs="Times New Roman"/>
+            <w:noProof/>
+          </w:rPr>
+          <w:t>1.3. Giới thiệu về công nghệ, ngôn ngữ sử dụng</w:t>
+        </w:r>
+        <w:r>
+          <w:rPr>
+            <w:noProof/>
+            <w:webHidden/>
+          </w:rPr>
+          <w:tab/>
+        </w:r>
+        <w:r>
+          <w:rPr>
+            <w:noProof/>
+            <w:webHidden/>
+          </w:rPr>
+          <w:fldChar w:fldCharType="begin"/>
+        </w:r>
+        <w:r>
+          <w:rPr>
+            <w:noProof/>
+            <w:webHidden/>
+          </w:rPr>
+          <w:instrText xml:space="preserve"> PAGEREF _Toc229000280 \h </w:instrText>
+        </w:r>
+        <w:r>
+          <w:rPr>
+            <w:noProof/>
+            <w:webHidden/>
+          </w:rPr>
+        </w:r>
+        <w:r>
+          <w:rPr>
+            <w:noProof/>
+            <w:webHidden/>
+          </w:rPr>
+          <w:fldChar w:fldCharType="separate"/>
+        </w:r>
+        <w:r>
+          <w:rPr>
+            <w:noProof/>
+            <w:webHidden/>
+          </w:rPr>
+          <w:t>12</w:t>
         </w:r>
         <w:r>
           <w:rPr>
@@ -1043,13 +1277,14 @@
           <w14:ligatures w14:val="standardContextual"/>
         </w:rPr>
       </w:pPr>
-      <w:hyperlink w:anchor="_Toc228292407" w:history="1">
+      <w:hyperlink w:anchor="_Toc229000281" w:history="1">
         <w:r>
           <w:rPr>
             <w:rStyle w:val="Hyperlink"/>
-            <w:noProof/>
-          </w:rPr>
-          <w:t>1.2.5. Định hướng giải quyết</w:t>
+            <w:rFonts w:cs="Times New Roman"/>
+            <w:noProof/>
+          </w:rPr>
+          <w:t>1.3.1. Ngôn ngữ JavaScript và TypeScript</w:t>
         </w:r>
         <w:r>
           <w:rPr>
@@ -1070,7 +1305,7 @@
             <w:noProof/>
             <w:webHidden/>
           </w:rPr>
-          <w:instrText xml:space="preserve"> PAGEREF _Toc228292407 \h </w:instrText>
+          <w:instrText xml:space="preserve"> PAGEREF _Toc229000281 \h </w:instrText>
         </w:r>
         <w:r>
           <w:rPr>
@@ -1090,7 +1325,7 @@
             <w:noProof/>
             <w:webHidden/>
           </w:rPr>
-          <w:t>10</w:t>
+          <w:t>12</w:t>
         </w:r>
         <w:r>
           <w:rPr>
@@ -1116,13 +1351,14 @@
           <w14:ligatures w14:val="standardContextual"/>
         </w:rPr>
       </w:pPr>
-      <w:hyperlink w:anchor="_Toc228292408" w:history="1">
+      <w:hyperlink w:anchor="_Toc229000282" w:history="1">
         <w:r>
           <w:rPr>
             <w:rStyle w:val="Hyperlink"/>
-            <w:noProof/>
-          </w:rPr>
-          <w:t>1.2.6. Xác định yêu cầu hệ thống</w:t>
+            <w:rFonts w:cs="Times New Roman"/>
+            <w:noProof/>
+          </w:rPr>
+          <w:t>1.3.2. Công nghệ Next.js cho giao diện người dùng</w:t>
         </w:r>
         <w:r>
           <w:rPr>
@@ -1143,7 +1379,7 @@
             <w:noProof/>
             <w:webHidden/>
           </w:rPr>
-          <w:instrText xml:space="preserve"> PAGEREF _Toc228292408 \h </w:instrText>
+          <w:instrText xml:space="preserve"> PAGEREF _Toc229000282 \h </w:instrText>
         </w:r>
         <w:r>
           <w:rPr>
@@ -1163,7 +1399,7 @@
             <w:noProof/>
             <w:webHidden/>
           </w:rPr>
-          <w:t>11</w:t>
+          <w:t>13</w:t>
         </w:r>
         <w:r>
           <w:rPr>
@@ -1189,13 +1425,14 @@
           <w14:ligatures w14:val="standardContextual"/>
         </w:rPr>
       </w:pPr>
-      <w:hyperlink w:anchor="_Toc228292409" w:history="1">
+      <w:hyperlink w:anchor="_Toc229000283" w:history="1">
         <w:r>
           <w:rPr>
             <w:rStyle w:val="Hyperlink"/>
-            <w:noProof/>
-          </w:rPr>
-          <w:t>1.3. Giới thiệu về công nghệ, ngôn ngữ sử dụng</w:t>
+            <w:rFonts w:cs="Times New Roman"/>
+            <w:noProof/>
+          </w:rPr>
+          <w:t>1.3.3. Công nghệ NestJS cho backend</w:t>
         </w:r>
         <w:r>
           <w:rPr>
@@ -1216,7 +1453,7 @@
             <w:noProof/>
             <w:webHidden/>
           </w:rPr>
-          <w:instrText xml:space="preserve"> PAGEREF _Toc228292409 \h </w:instrText>
+          <w:instrText xml:space="preserve"> PAGEREF _Toc229000283 \h </w:instrText>
         </w:r>
         <w:r>
           <w:rPr>
@@ -1236,7 +1473,7 @@
             <w:noProof/>
             <w:webHidden/>
           </w:rPr>
-          <w:t>12</w:t>
+          <w:t>13</w:t>
         </w:r>
         <w:r>
           <w:rPr>
@@ -1262,13 +1499,14 @@
           <w14:ligatures w14:val="standardContextual"/>
         </w:rPr>
       </w:pPr>
-      <w:hyperlink w:anchor="_Toc228292410" w:history="1">
+      <w:hyperlink w:anchor="_Toc229000284" w:history="1">
         <w:r>
           <w:rPr>
             <w:rStyle w:val="Hyperlink"/>
-            <w:noProof/>
-          </w:rPr>
-          <w:t>1.3.1. Kiến trúc tổng thể của hệ thống</w:t>
+            <w:rFonts w:cs="Times New Roman"/>
+            <w:noProof/>
+          </w:rPr>
+          <w:t>1.3.4. Cơ sở dữ liệu PostgreSQL hoặc MySQL</w:t>
         </w:r>
         <w:r>
           <w:rPr>
@@ -1289,7 +1527,7 @@
             <w:noProof/>
             <w:webHidden/>
           </w:rPr>
-          <w:instrText xml:space="preserve"> PAGEREF _Toc228292410 \h </w:instrText>
+          <w:instrText xml:space="preserve"> PAGEREF _Toc229000284 \h </w:instrText>
         </w:r>
         <w:r>
           <w:rPr>
@@ -1309,7 +1547,7 @@
             <w:noProof/>
             <w:webHidden/>
           </w:rPr>
-          <w:t>12</w:t>
+          <w:t>14</w:t>
         </w:r>
         <w:r>
           <w:rPr>
@@ -1335,13 +1573,14 @@
           <w14:ligatures w14:val="standardContextual"/>
         </w:rPr>
       </w:pPr>
-      <w:hyperlink w:anchor="_Toc228292411" w:history="1">
+      <w:hyperlink w:anchor="_Toc229000285" w:history="1">
         <w:r>
           <w:rPr>
             <w:rStyle w:val="Hyperlink"/>
-            <w:noProof/>
-          </w:rPr>
-          <w:t>1.3.2. Công nghệ Next.js cho giao diện người dùng</w:t>
+            <w:rFonts w:cs="Times New Roman"/>
+            <w:noProof/>
+          </w:rPr>
+          <w:t>1.3.5. OpenAI API, mô hình GPT và AI Agent</w:t>
         </w:r>
         <w:r>
           <w:rPr>
@@ -1362,7 +1601,7 @@
             <w:noProof/>
             <w:webHidden/>
           </w:rPr>
-          <w:instrText xml:space="preserve"> PAGEREF _Toc228292411 \h </w:instrText>
+          <w:instrText xml:space="preserve"> PAGEREF _Toc229000285 \h </w:instrText>
         </w:r>
         <w:r>
           <w:rPr>
@@ -1382,7 +1621,7 @@
             <w:noProof/>
             <w:webHidden/>
           </w:rPr>
-          <w:t>12</w:t>
+          <w:t>14</w:t>
         </w:r>
         <w:r>
           <w:rPr>
@@ -1408,13 +1647,14 @@
           <w14:ligatures w14:val="standardContextual"/>
         </w:rPr>
       </w:pPr>
-      <w:hyperlink w:anchor="_Toc228292412" w:history="1">
+      <w:hyperlink w:anchor="_Toc229000286" w:history="1">
         <w:r>
           <w:rPr>
             <w:rStyle w:val="Hyperlink"/>
-            <w:noProof/>
-          </w:rPr>
-          <w:t>1.3.3. Công nghệ NestJS cho backend</w:t>
+            <w:rFonts w:cs="Times New Roman"/>
+            <w:noProof/>
+          </w:rPr>
+          <w:t>1.3.6. Công cụ phát triển và quản lý mã nguồn</w:t>
         </w:r>
         <w:r>
           <w:rPr>
@@ -1435,7 +1675,7 @@
             <w:noProof/>
             <w:webHidden/>
           </w:rPr>
-          <w:instrText xml:space="preserve"> PAGEREF _Toc228292412 \h </w:instrText>
+          <w:instrText xml:space="preserve"> PAGEREF _Toc229000286 \h </w:instrText>
         </w:r>
         <w:r>
           <w:rPr>
@@ -1455,7 +1695,7 @@
             <w:noProof/>
             <w:webHidden/>
           </w:rPr>
-          <w:t>13</w:t>
+          <w:t>15</w:t>
         </w:r>
         <w:r>
           <w:rPr>
@@ -1468,7 +1708,7 @@
     </w:p>
     <w:p>
       <w:pPr>
-        <w:pStyle w:val="TOC3"/>
+        <w:pStyle w:val="TOC2"/>
         <w:tabs>
           <w:tab w:val="right" w:leader="dot" w:pos="8778"/>
         </w:tabs>
@@ -1481,13 +1721,14 @@
           <w14:ligatures w14:val="standardContextual"/>
         </w:rPr>
       </w:pPr>
-      <w:hyperlink w:anchor="_Toc228292413" w:history="1">
+      <w:hyperlink w:anchor="_Toc229000287" w:history="1">
         <w:r>
           <w:rPr>
             <w:rStyle w:val="Hyperlink"/>
-            <w:noProof/>
-          </w:rPr>
-          <w:t>1.3.4. Cơ sở dữ liệu PostgreSQL hoặc MySQL</w:t>
+            <w:rFonts w:cs="Times New Roman"/>
+            <w:noProof/>
+          </w:rPr>
+          <w:t>1.4. Kết luận chương 1</w:t>
         </w:r>
         <w:r>
           <w:rPr>
@@ -1508,226 +1749,7 @@
             <w:noProof/>
             <w:webHidden/>
           </w:rPr>
-          <w:instrText xml:space="preserve"> PAGEREF _Toc228292413 \h </w:instrText>
-        </w:r>
-        <w:r>
-          <w:rPr>
-            <w:noProof/>
-            <w:webHidden/>
-          </w:rPr>
-        </w:r>
-        <w:r>
-          <w:rPr>
-            <w:noProof/>
-            <w:webHidden/>
-          </w:rPr>
-          <w:fldChar w:fldCharType="separate"/>
-        </w:r>
-        <w:r>
-          <w:rPr>
-            <w:noProof/>
-            <w:webHidden/>
-          </w:rPr>
-          <w:t>13</w:t>
-        </w:r>
-        <w:r>
-          <w:rPr>
-            <w:noProof/>
-            <w:webHidden/>
-          </w:rPr>
-          <w:fldChar w:fldCharType="end"/>
-        </w:r>
-      </w:hyperlink>
-    </w:p>
-    <w:p>
-      <w:pPr>
-        <w:pStyle w:val="TOC3"/>
-        <w:tabs>
-          <w:tab w:val="right" w:leader="dot" w:pos="8778"/>
-        </w:tabs>
-        <w:rPr>
-          <w:rFonts w:asciiTheme="minorHAnsi" w:eastAsiaTheme="minorEastAsia" w:hAnsiTheme="minorHAnsi"/>
-          <w:noProof/>
-          <w:kern w:val="2"/>
-          <w:sz w:val="24"/>
-          <w:szCs w:val="24"/>
-          <w14:ligatures w14:val="standardContextual"/>
-        </w:rPr>
-      </w:pPr>
-      <w:hyperlink w:anchor="_Toc228292414" w:history="1">
-        <w:r>
-          <w:rPr>
-            <w:rStyle w:val="Hyperlink"/>
-            <w:noProof/>
-          </w:rPr>
-          <w:t>1.3.5. OpenAI API, mô hình GPT và AI Agent</w:t>
-        </w:r>
-        <w:r>
-          <w:rPr>
-            <w:noProof/>
-            <w:webHidden/>
-          </w:rPr>
-          <w:tab/>
-        </w:r>
-        <w:r>
-          <w:rPr>
-            <w:noProof/>
-            <w:webHidden/>
-          </w:rPr>
-          <w:fldChar w:fldCharType="begin"/>
-        </w:r>
-        <w:r>
-          <w:rPr>
-            <w:noProof/>
-            <w:webHidden/>
-          </w:rPr>
-          <w:instrText xml:space="preserve"> PAGEREF _Toc228292414 \h </w:instrText>
-        </w:r>
-        <w:r>
-          <w:rPr>
-            <w:noProof/>
-            <w:webHidden/>
-          </w:rPr>
-        </w:r>
-        <w:r>
-          <w:rPr>
-            <w:noProof/>
-            <w:webHidden/>
-          </w:rPr>
-          <w:fldChar w:fldCharType="separate"/>
-        </w:r>
-        <w:r>
-          <w:rPr>
-            <w:noProof/>
-            <w:webHidden/>
-          </w:rPr>
-          <w:t>14</w:t>
-        </w:r>
-        <w:r>
-          <w:rPr>
-            <w:noProof/>
-            <w:webHidden/>
-          </w:rPr>
-          <w:fldChar w:fldCharType="end"/>
-        </w:r>
-      </w:hyperlink>
-    </w:p>
-    <w:p>
-      <w:pPr>
-        <w:pStyle w:val="TOC3"/>
-        <w:tabs>
-          <w:tab w:val="right" w:leader="dot" w:pos="8778"/>
-        </w:tabs>
-        <w:rPr>
-          <w:rFonts w:asciiTheme="minorHAnsi" w:eastAsiaTheme="minorEastAsia" w:hAnsiTheme="minorHAnsi"/>
-          <w:noProof/>
-          <w:kern w:val="2"/>
-          <w:sz w:val="24"/>
-          <w:szCs w:val="24"/>
-          <w14:ligatures w14:val="standardContextual"/>
-        </w:rPr>
-      </w:pPr>
-      <w:hyperlink w:anchor="_Toc228292415" w:history="1">
-        <w:r>
-          <w:rPr>
-            <w:rStyle w:val="Hyperlink"/>
-            <w:noProof/>
-          </w:rPr>
-          <w:t>1.3.6. Công cụ phát triển và quản lý mã nguồn</w:t>
-        </w:r>
-        <w:r>
-          <w:rPr>
-            <w:noProof/>
-            <w:webHidden/>
-          </w:rPr>
-          <w:tab/>
-        </w:r>
-        <w:r>
-          <w:rPr>
-            <w:noProof/>
-            <w:webHidden/>
-          </w:rPr>
-          <w:fldChar w:fldCharType="begin"/>
-        </w:r>
-        <w:r>
-          <w:rPr>
-            <w:noProof/>
-            <w:webHidden/>
-          </w:rPr>
-          <w:instrText xml:space="preserve"> PAGEREF _Toc228292415 \h </w:instrText>
-        </w:r>
-        <w:r>
-          <w:rPr>
-            <w:noProof/>
-            <w:webHidden/>
-          </w:rPr>
-        </w:r>
-        <w:r>
-          <w:rPr>
-            <w:noProof/>
-            <w:webHidden/>
-          </w:rPr>
-          <w:fldChar w:fldCharType="separate"/>
-        </w:r>
-        <w:r>
-          <w:rPr>
-            <w:noProof/>
-            <w:webHidden/>
-          </w:rPr>
-          <w:t>14</w:t>
-        </w:r>
-        <w:r>
-          <w:rPr>
-            <w:noProof/>
-            <w:webHidden/>
-          </w:rPr>
-          <w:fldChar w:fldCharType="end"/>
-        </w:r>
-      </w:hyperlink>
-    </w:p>
-    <w:p>
-      <w:pPr>
-        <w:pStyle w:val="TOC3"/>
-        <w:tabs>
-          <w:tab w:val="right" w:leader="dot" w:pos="8778"/>
-        </w:tabs>
-        <w:rPr>
-          <w:rFonts w:asciiTheme="minorHAnsi" w:eastAsiaTheme="minorEastAsia" w:hAnsiTheme="minorHAnsi"/>
-          <w:noProof/>
-          <w:kern w:val="2"/>
-          <w:sz w:val="24"/>
-          <w:szCs w:val="24"/>
-          <w14:ligatures w14:val="standardContextual"/>
-        </w:rPr>
-      </w:pPr>
-      <w:hyperlink w:anchor="_Toc228292416" w:history="1">
-        <w:r>
-          <w:rPr>
-            <w:rStyle w:val="Hyperlink"/>
-            <w:noProof/>
-          </w:rPr>
-          <w:t>1.4. Kết luận chương 1</w:t>
-        </w:r>
-        <w:r>
-          <w:rPr>
-            <w:noProof/>
-            <w:webHidden/>
-          </w:rPr>
-          <w:tab/>
-        </w:r>
-        <w:r>
-          <w:rPr>
-            <w:noProof/>
-            <w:webHidden/>
-          </w:rPr>
-          <w:fldChar w:fldCharType="begin"/>
-        </w:r>
-        <w:r>
-          <w:rPr>
-            <w:noProof/>
-            <w:webHidden/>
-          </w:rPr>
-          <w:instrText xml:space="preserve"> PAGEREF _Toc228292416 \h </w:instrText>
+          <w:instrText xml:space="preserve"> PAGEREF _Toc229000287 \h </w:instrText>
         </w:r>
         <w:r>
           <w:rPr>
@@ -1774,13 +1796,16 @@
     <w:p>
       <w:pPr>
         <w:pStyle w:val="Heading1"/>
-        <w:spacing w:before="0" w:after="240" w:line="312" w:lineRule="auto"/>
+        <w:spacing w:before="60" w:after="120" w:line="312" w:lineRule="auto"/>
         <w:jc w:val="center"/>
-      </w:pPr>
-      <w:bookmarkStart w:id="0" w:name="_Toc228292395"/>
+        <w:rPr>
+          <w:rFonts w:ascii="Times New Roman" w:hAnsi="Times New Roman" w:cs="Times New Roman"/>
+        </w:rPr>
+      </w:pPr>
+      <w:bookmarkStart w:id="0" w:name="_Toc229000266"/>
       <w:r>
         <w:rPr>
-          <w:rFonts w:ascii="Times New Roman" w:eastAsia="Times New Roman" w:hAnsi="Times New Roman"/>
+          <w:rFonts w:ascii="Times New Roman" w:eastAsia="Times New Roman" w:hAnsi="Times New Roman" w:cs="Times New Roman"/>
         </w:rPr>
         <w:lastRenderedPageBreak/>
         <w:t>CHƯƠNG 1: GIỚI THIỆU TỔNG QUAN</w:t>
@@ -1789,13 +1814,16 @@
     </w:p>
     <w:p>
       <w:pPr>
-        <w:pStyle w:val="Heading3"/>
-        <w:spacing w:before="0" w:after="120" w:line="312" w:lineRule="auto"/>
-      </w:pPr>
-      <w:bookmarkStart w:id="1" w:name="_Toc228292396"/>
+        <w:pStyle w:val="Heading2"/>
+        <w:spacing w:before="60" w:after="120" w:line="312" w:lineRule="auto"/>
+        <w:rPr>
+          <w:rFonts w:ascii="Times New Roman" w:hAnsi="Times New Roman" w:cs="Times New Roman"/>
+        </w:rPr>
+      </w:pPr>
+      <w:bookmarkStart w:id="1" w:name="_Toc229000267"/>
       <w:r>
         <w:rPr>
-          <w:rFonts w:ascii="Times New Roman" w:eastAsia="Times New Roman" w:hAnsi="Times New Roman"/>
+          <w:rFonts w:ascii="Times New Roman" w:eastAsia="Times New Roman" w:hAnsi="Times New Roman" w:cs="Times New Roman"/>
         </w:rPr>
         <w:t>1.1. Giới thiệu chung</w:t>
       </w:r>
@@ -1804,12 +1832,15 @@
     <w:p>
       <w:pPr>
         <w:pStyle w:val="Heading3"/>
-        <w:spacing w:before="0" w:after="120" w:line="312" w:lineRule="auto"/>
-      </w:pPr>
-      <w:bookmarkStart w:id="2" w:name="_Toc228292397"/>
+        <w:spacing w:before="60" w:after="120" w:line="312" w:lineRule="auto"/>
+        <w:rPr>
+          <w:rFonts w:ascii="Times New Roman" w:hAnsi="Times New Roman" w:cs="Times New Roman"/>
+        </w:rPr>
+      </w:pPr>
+      <w:bookmarkStart w:id="2" w:name="_Toc229000268"/>
       <w:r>
         <w:rPr>
-          <w:rFonts w:ascii="Times New Roman" w:eastAsia="Times New Roman" w:hAnsi="Times New Roman"/>
+          <w:rFonts w:ascii="Times New Roman" w:eastAsia="Times New Roman" w:hAnsi="Times New Roman" w:cs="Times New Roman"/>
         </w:rPr>
         <w:t>1.1.1. Tổng quan về thương mại điện tử</w:t>
       </w:r>
@@ -1862,12 +1893,15 @@
     <w:p>
       <w:pPr>
         <w:pStyle w:val="Heading3"/>
-        <w:spacing w:before="0" w:after="120" w:line="312" w:lineRule="auto"/>
-      </w:pPr>
-      <w:bookmarkStart w:id="3" w:name="_Toc228292398"/>
+        <w:spacing w:before="60" w:after="120" w:line="312" w:lineRule="auto"/>
+        <w:rPr>
+          <w:rFonts w:ascii="Times New Roman" w:hAnsi="Times New Roman" w:cs="Times New Roman"/>
+        </w:rPr>
+      </w:pPr>
+      <w:bookmarkStart w:id="3" w:name="_Toc229000269"/>
       <w:r>
         <w:rPr>
-          <w:rFonts w:ascii="Times New Roman" w:eastAsia="Times New Roman" w:hAnsi="Times New Roman"/>
+          <w:rFonts w:ascii="Times New Roman" w:eastAsia="Times New Roman" w:hAnsi="Times New Roman" w:cs="Times New Roman"/>
         </w:rPr>
         <w:t>1.1.2. Đặc điểm của thương mại điện tử trong lĩnh vực máy tính và linh kiện</w:t>
       </w:r>
@@ -1920,12 +1954,15 @@
     <w:p>
       <w:pPr>
         <w:pStyle w:val="Heading3"/>
-        <w:spacing w:before="0" w:after="120" w:line="312" w:lineRule="auto"/>
-      </w:pPr>
-      <w:bookmarkStart w:id="4" w:name="_Toc228292399"/>
+        <w:spacing w:before="60" w:after="120" w:line="312" w:lineRule="auto"/>
+        <w:rPr>
+          <w:rFonts w:ascii="Times New Roman" w:hAnsi="Times New Roman" w:cs="Times New Roman"/>
+        </w:rPr>
+      </w:pPr>
+      <w:bookmarkStart w:id="4" w:name="_Toc229000270"/>
       <w:r>
         <w:rPr>
-          <w:rFonts w:ascii="Times New Roman" w:eastAsia="Times New Roman" w:hAnsi="Times New Roman"/>
+          <w:rFonts w:ascii="Times New Roman" w:eastAsia="Times New Roman" w:hAnsi="Times New Roman" w:cs="Times New Roman"/>
         </w:rPr>
         <w:t>1.1.3. Thuận lợi khi ứng dụng thương mại điện tử</w:t>
       </w:r>
@@ -1974,12 +2011,15 @@
     <w:p>
       <w:pPr>
         <w:pStyle w:val="Heading3"/>
-        <w:spacing w:before="0" w:after="120" w:line="312" w:lineRule="auto"/>
-      </w:pPr>
-      <w:bookmarkStart w:id="5" w:name="_Toc228292400"/>
+        <w:spacing w:before="60" w:after="120" w:line="312" w:lineRule="auto"/>
+        <w:rPr>
+          <w:rFonts w:ascii="Times New Roman" w:hAnsi="Times New Roman" w:cs="Times New Roman"/>
+        </w:rPr>
+      </w:pPr>
+      <w:bookmarkStart w:id="5" w:name="_Toc229000271"/>
       <w:r>
         <w:rPr>
-          <w:rFonts w:ascii="Times New Roman" w:eastAsia="Times New Roman" w:hAnsi="Times New Roman"/>
+          <w:rFonts w:ascii="Times New Roman" w:eastAsia="Times New Roman" w:hAnsi="Times New Roman" w:cs="Times New Roman"/>
         </w:rPr>
         <w:t>1.1.4. Khó khăn và thách thức khi triển khai thương mại điện tử</w:t>
       </w:r>
@@ -2032,12 +2072,15 @@
     <w:p>
       <w:pPr>
         <w:pStyle w:val="Heading3"/>
-        <w:spacing w:before="0" w:after="120" w:line="312" w:lineRule="auto"/>
-      </w:pPr>
-      <w:bookmarkStart w:id="6" w:name="_Toc228292401"/>
+        <w:spacing w:before="60" w:after="120" w:line="312" w:lineRule="auto"/>
+        <w:rPr>
+          <w:rFonts w:ascii="Times New Roman" w:hAnsi="Times New Roman" w:cs="Times New Roman"/>
+        </w:rPr>
+      </w:pPr>
+      <w:bookmarkStart w:id="6" w:name="_Toc229000272"/>
       <w:r>
         <w:rPr>
-          <w:rFonts w:ascii="Times New Roman" w:eastAsia="Times New Roman" w:hAnsi="Times New Roman"/>
+          <w:rFonts w:ascii="Times New Roman" w:eastAsia="Times New Roman" w:hAnsi="Times New Roman" w:cs="Times New Roman"/>
         </w:rPr>
         <w:t>1.1.5. Giới thiệu về công ty GTech và định hướng xây dựng website</w:t>
       </w:r>
@@ -2091,10 +2134,15 @@
       <w:pPr>
         <w:spacing w:before="120" w:after="60" w:line="312" w:lineRule="auto"/>
         <w:jc w:val="center"/>
+        <w:rPr>
+          <w:rFonts w:cs="Times New Roman"/>
+          <w:i/>
+        </w:rPr>
       </w:pPr>
       <w:r>
         <w:rPr>
-          <w:b/>
+          <w:rFonts w:cs="Times New Roman"/>
+          <w:i/>
         </w:rPr>
         <w:t>Bảng 1.1. Một số thuận lợi và khó khăn khi ứng dụng thương mại điện tử trong lĩnh vực bán máy tính</w:t>
       </w:r>
@@ -2123,7 +2171,7 @@
           <w:p>
             <w:pPr>
               <w:spacing w:line="312" w:lineRule="auto"/>
-              <w:jc w:val="center"/>
+              <w:jc w:val="both"/>
             </w:pPr>
             <w:r>
               <w:rPr>
@@ -2142,7 +2190,7 @@
           <w:p>
             <w:pPr>
               <w:spacing w:line="312" w:lineRule="auto"/>
-              <w:jc w:val="center"/>
+              <w:jc w:val="both"/>
             </w:pPr>
             <w:r>
               <w:rPr>
@@ -2161,7 +2209,7 @@
           <w:p>
             <w:pPr>
               <w:spacing w:line="312" w:lineRule="auto"/>
-              <w:jc w:val="center"/>
+              <w:jc w:val="both"/>
             </w:pPr>
             <w:r>
               <w:rPr>
@@ -2185,7 +2233,7 @@
           <w:p>
             <w:pPr>
               <w:spacing w:line="312" w:lineRule="auto"/>
-              <w:jc w:val="center"/>
+              <w:jc w:val="both"/>
             </w:pPr>
             <w:r>
               <w:rPr>
@@ -2244,7 +2292,7 @@
           <w:p>
             <w:pPr>
               <w:spacing w:line="312" w:lineRule="auto"/>
-              <w:jc w:val="center"/>
+              <w:jc w:val="both"/>
             </w:pPr>
             <w:r>
               <w:rPr>
@@ -2303,7 +2351,7 @@
           <w:p>
             <w:pPr>
               <w:spacing w:line="312" w:lineRule="auto"/>
-              <w:jc w:val="center"/>
+              <w:jc w:val="both"/>
             </w:pPr>
             <w:r>
               <w:rPr>
@@ -2362,7 +2410,7 @@
           <w:p>
             <w:pPr>
               <w:spacing w:line="312" w:lineRule="auto"/>
-              <w:jc w:val="center"/>
+              <w:jc w:val="both"/>
             </w:pPr>
             <w:r>
               <w:rPr>
@@ -2412,13 +2460,16 @@
     </w:tbl>
     <w:p>
       <w:pPr>
-        <w:pStyle w:val="Heading3"/>
-        <w:spacing w:before="0" w:after="120" w:line="312" w:lineRule="auto"/>
-      </w:pPr>
-      <w:bookmarkStart w:id="7" w:name="_Toc228292402"/>
+        <w:pStyle w:val="Heading2"/>
+        <w:spacing w:before="60" w:after="120" w:line="312" w:lineRule="auto"/>
+        <w:rPr>
+          <w:rFonts w:ascii="Times New Roman" w:hAnsi="Times New Roman" w:cs="Times New Roman"/>
+        </w:rPr>
+      </w:pPr>
+      <w:bookmarkStart w:id="7" w:name="_Toc229000273"/>
       <w:r>
         <w:rPr>
-          <w:rFonts w:ascii="Times New Roman" w:eastAsia="Times New Roman" w:hAnsi="Times New Roman"/>
+          <w:rFonts w:ascii="Times New Roman" w:eastAsia="Times New Roman" w:hAnsi="Times New Roman" w:cs="Times New Roman"/>
         </w:rPr>
         <w:lastRenderedPageBreak/>
         <w:t>1.2. Nghiên cứu hiện trạng và giải quyết vấn đề</w:t>
@@ -2428,12 +2479,15 @@
     <w:p>
       <w:pPr>
         <w:pStyle w:val="Heading3"/>
-        <w:spacing w:before="0" w:after="120" w:line="312" w:lineRule="auto"/>
-      </w:pPr>
-      <w:bookmarkStart w:id="8" w:name="_Toc228292403"/>
+        <w:spacing w:before="60" w:after="120" w:line="312" w:lineRule="auto"/>
+        <w:rPr>
+          <w:rFonts w:ascii="Times New Roman" w:hAnsi="Times New Roman" w:cs="Times New Roman"/>
+        </w:rPr>
+      </w:pPr>
+      <w:bookmarkStart w:id="8" w:name="_Toc229000274"/>
       <w:r>
         <w:rPr>
-          <w:rFonts w:ascii="Times New Roman" w:eastAsia="Times New Roman" w:hAnsi="Times New Roman"/>
+          <w:rFonts w:ascii="Times New Roman" w:eastAsia="Times New Roman" w:hAnsi="Times New Roman" w:cs="Times New Roman"/>
         </w:rPr>
         <w:t>1.2.1. Hiện trạng hoạt động kinh doanh của GTech</w:t>
       </w:r>
@@ -2472,12 +2526,15 @@
     <w:p>
       <w:pPr>
         <w:pStyle w:val="Heading3"/>
-        <w:spacing w:before="0" w:after="120" w:line="312" w:lineRule="auto"/>
-      </w:pPr>
-      <w:bookmarkStart w:id="9" w:name="_Toc228292404"/>
+        <w:spacing w:before="60" w:after="120" w:line="312" w:lineRule="auto"/>
+        <w:rPr>
+          <w:rFonts w:ascii="Times New Roman" w:hAnsi="Times New Roman" w:cs="Times New Roman"/>
+        </w:rPr>
+      </w:pPr>
+      <w:bookmarkStart w:id="9" w:name="_Toc229000275"/>
       <w:r>
         <w:rPr>
-          <w:rFonts w:ascii="Times New Roman" w:eastAsia="Times New Roman" w:hAnsi="Times New Roman"/>
+          <w:rFonts w:ascii="Times New Roman" w:eastAsia="Times New Roman" w:hAnsi="Times New Roman" w:cs="Times New Roman"/>
         </w:rPr>
         <w:t>1.2.2. Cơ cấu tổ chức liên quan đến hệ thống</w:t>
       </w:r>
@@ -2510,12 +2567,15 @@
     <w:p>
       <w:pPr>
         <w:pStyle w:val="Heading3"/>
-        <w:spacing w:before="0" w:after="120" w:line="312" w:lineRule="auto"/>
-      </w:pPr>
-      <w:bookmarkStart w:id="10" w:name="_Toc228292405"/>
+        <w:spacing w:before="60" w:after="120" w:line="312" w:lineRule="auto"/>
+        <w:rPr>
+          <w:rFonts w:ascii="Times New Roman" w:hAnsi="Times New Roman" w:cs="Times New Roman"/>
+        </w:rPr>
+      </w:pPr>
+      <w:bookmarkStart w:id="10" w:name="_Toc229000276"/>
       <w:r>
         <w:rPr>
-          <w:rFonts w:ascii="Times New Roman" w:eastAsia="Times New Roman" w:hAnsi="Times New Roman"/>
+          <w:rFonts w:ascii="Times New Roman" w:eastAsia="Times New Roman" w:hAnsi="Times New Roman" w:cs="Times New Roman"/>
         </w:rPr>
         <w:t>1.2.3. Mô tả hoạt động của các bộ phận</w:t>
       </w:r>
@@ -2564,12 +2624,15 @@
     <w:p>
       <w:pPr>
         <w:pStyle w:val="Heading3"/>
-        <w:spacing w:before="0" w:after="120" w:line="312" w:lineRule="auto"/>
-      </w:pPr>
-      <w:bookmarkStart w:id="11" w:name="_Toc228292406"/>
+        <w:spacing w:before="60" w:after="120" w:line="312" w:lineRule="auto"/>
+        <w:rPr>
+          <w:rFonts w:ascii="Times New Roman" w:hAnsi="Times New Roman" w:cs="Times New Roman"/>
+        </w:rPr>
+      </w:pPr>
+      <w:bookmarkStart w:id="11" w:name="_Toc229000277"/>
       <w:r>
         <w:rPr>
-          <w:rFonts w:ascii="Times New Roman" w:eastAsia="Times New Roman" w:hAnsi="Times New Roman"/>
+          <w:rFonts w:ascii="Times New Roman" w:eastAsia="Times New Roman" w:hAnsi="Times New Roman" w:cs="Times New Roman"/>
         </w:rPr>
         <w:t>1.2.4. Các vấn đề tồn tại</w:t>
       </w:r>
@@ -2612,12 +2675,15 @@
     <w:p>
       <w:pPr>
         <w:pStyle w:val="Heading3"/>
-        <w:spacing w:before="0" w:after="120" w:line="312" w:lineRule="auto"/>
-      </w:pPr>
-      <w:bookmarkStart w:id="12" w:name="_Toc228292407"/>
+        <w:spacing w:before="60" w:after="120" w:line="312" w:lineRule="auto"/>
+        <w:rPr>
+          <w:rFonts w:ascii="Times New Roman" w:hAnsi="Times New Roman" w:cs="Times New Roman"/>
+        </w:rPr>
+      </w:pPr>
+      <w:bookmarkStart w:id="12" w:name="_Toc229000278"/>
       <w:r>
         <w:rPr>
-          <w:rFonts w:ascii="Times New Roman" w:eastAsia="Times New Roman" w:hAnsi="Times New Roman"/>
+          <w:rFonts w:ascii="Times New Roman" w:eastAsia="Times New Roman" w:hAnsi="Times New Roman" w:cs="Times New Roman"/>
         </w:rPr>
         <w:t>1.2.5. Định hướng giải quyết</w:t>
       </w:r>
@@ -2670,12 +2736,15 @@
     <w:p>
       <w:pPr>
         <w:pStyle w:val="Heading3"/>
-        <w:spacing w:before="0" w:after="120" w:line="312" w:lineRule="auto"/>
-      </w:pPr>
-      <w:bookmarkStart w:id="13" w:name="_Toc228292408"/>
+        <w:spacing w:before="60" w:after="120" w:line="312" w:lineRule="auto"/>
+        <w:rPr>
+          <w:rFonts w:ascii="Times New Roman" w:hAnsi="Times New Roman" w:cs="Times New Roman"/>
+        </w:rPr>
+      </w:pPr>
+      <w:bookmarkStart w:id="13" w:name="_Toc229000279"/>
       <w:r>
         <w:rPr>
-          <w:rFonts w:ascii="Times New Roman" w:eastAsia="Times New Roman" w:hAnsi="Times New Roman"/>
+          <w:rFonts w:ascii="Times New Roman" w:eastAsia="Times New Roman" w:hAnsi="Times New Roman" w:cs="Times New Roman"/>
         </w:rPr>
         <w:t>1.2.6. Xác định yêu cầu hệ thống</w:t>
       </w:r>
@@ -2695,10 +2764,15 @@
       <w:pPr>
         <w:spacing w:before="120" w:after="60" w:line="312" w:lineRule="auto"/>
         <w:jc w:val="center"/>
+        <w:rPr>
+          <w:rFonts w:cs="Times New Roman"/>
+          <w:i/>
+        </w:rPr>
       </w:pPr>
       <w:r>
         <w:rPr>
-          <w:b/>
+          <w:rFonts w:cs="Times New Roman"/>
+          <w:i/>
         </w:rPr>
         <w:t>Bảng 1.2. Nhóm yêu cầu chính của hệ thống website bán máy tính GTech</w:t>
       </w:r>
@@ -2727,7 +2801,7 @@
           <w:p>
             <w:pPr>
               <w:spacing w:line="312" w:lineRule="auto"/>
-              <w:jc w:val="center"/>
+              <w:jc w:val="both"/>
             </w:pPr>
             <w:r>
               <w:rPr>
@@ -2746,7 +2820,7 @@
           <w:p>
             <w:pPr>
               <w:spacing w:line="312" w:lineRule="auto"/>
-              <w:jc w:val="center"/>
+              <w:jc w:val="both"/>
             </w:pPr>
             <w:r>
               <w:rPr>
@@ -2765,7 +2839,7 @@
           <w:p>
             <w:pPr>
               <w:spacing w:line="312" w:lineRule="auto"/>
-              <w:jc w:val="center"/>
+              <w:jc w:val="both"/>
             </w:pPr>
             <w:r>
               <w:rPr>
@@ -2789,7 +2863,7 @@
           <w:p>
             <w:pPr>
               <w:spacing w:line="312" w:lineRule="auto"/>
-              <w:jc w:val="center"/>
+              <w:jc w:val="both"/>
             </w:pPr>
             <w:r>
               <w:rPr>
@@ -2848,7 +2922,7 @@
           <w:p>
             <w:pPr>
               <w:spacing w:line="312" w:lineRule="auto"/>
-              <w:jc w:val="center"/>
+              <w:jc w:val="both"/>
             </w:pPr>
             <w:r>
               <w:rPr>
@@ -2907,7 +2981,7 @@
           <w:p>
             <w:pPr>
               <w:spacing w:line="312" w:lineRule="auto"/>
-              <w:jc w:val="center"/>
+              <w:jc w:val="both"/>
             </w:pPr>
             <w:r>
               <w:rPr>
@@ -2966,7 +3040,7 @@
           <w:p>
             <w:pPr>
               <w:spacing w:line="312" w:lineRule="auto"/>
-              <w:jc w:val="center"/>
+              <w:jc w:val="both"/>
             </w:pPr>
             <w:r>
               <w:rPr>
@@ -3033,7 +3107,7 @@
           <w:p>
             <w:pPr>
               <w:spacing w:line="312" w:lineRule="auto"/>
-              <w:jc w:val="center"/>
+              <w:jc w:val="both"/>
             </w:pPr>
             <w:r>
               <w:rPr>
@@ -3083,13 +3157,16 @@
     </w:tbl>
     <w:p>
       <w:pPr>
-        <w:pStyle w:val="Heading3"/>
-        <w:spacing w:before="0" w:after="120" w:line="312" w:lineRule="auto"/>
-      </w:pPr>
-      <w:bookmarkStart w:id="14" w:name="_Toc228292409"/>
+        <w:pStyle w:val="Heading2"/>
+        <w:spacing w:before="60" w:after="120" w:line="312" w:lineRule="auto"/>
+        <w:rPr>
+          <w:rFonts w:ascii="Times New Roman" w:hAnsi="Times New Roman" w:cs="Times New Roman"/>
+        </w:rPr>
+      </w:pPr>
+      <w:bookmarkStart w:id="14" w:name="_Toc229000280"/>
       <w:r>
         <w:rPr>
-          <w:rFonts w:ascii="Times New Roman" w:eastAsia="Times New Roman" w:hAnsi="Times New Roman"/>
+          <w:rFonts w:ascii="Times New Roman" w:eastAsia="Times New Roman" w:hAnsi="Times New Roman" w:cs="Times New Roman"/>
         </w:rPr>
         <w:t>1.3. Giới thiệu về công nghệ, ngôn ngữ sử dụng</w:t>
       </w:r>
@@ -3097,20 +3174,6 @@
     </w:p>
     <w:p>
       <w:pPr>
-        <w:pStyle w:val="Heading3"/>
-        <w:spacing w:before="0" w:after="120" w:line="312" w:lineRule="auto"/>
-      </w:pPr>
-      <w:bookmarkStart w:id="15" w:name="_Toc228292410"/>
-      <w:r>
-        <w:rPr>
-          <w:rFonts w:ascii="Times New Roman" w:eastAsia="Times New Roman" w:hAnsi="Times New Roman"/>
-        </w:rPr>
-        <w:t>1.3.1. Kiến trúc tổng thể của hệ thống</w:t>
-      </w:r>
-      <w:bookmarkEnd w:id="15"/>
-    </w:p>
-    <w:p>
-      <w:pPr>
         <w:spacing w:after="120" w:line="312" w:lineRule="auto"/>
         <w:ind w:firstLine="720"/>
         <w:jc w:val="both"/>
@@ -3126,18 +3189,59 @@
         <w:jc w:val="both"/>
       </w:pPr>
       <w:r>
-        <w:t>Bên cạnh ba thành phần trên, hệ thống còn tích hợp thành phần AI hỗ trợ mua bán hàng. Thành phần này có thể hoạt động thông qua OpenAI API, sử dụng các mô hình GPT để xử lý yêu cầu ngôn ngữ tự nhiên và trả kết quả về backend. AI không thay thế hoàn toàn nghiệp vụ bán hàng, mà đóng vai trò hỗ trợ tư vấn, giải thích thông tin sản phẩm và gợi ý lựa chọn dựa trên dữ liệu có sẵn trong hệ thống. Cách tổ chức này giúp đảm bảo các quyết định quan trọng vẫn được kiểm soát bởi hệ thống nghiệp vụ và người quản trị.</w:t>
+        <w:t>Bên cạnh ba thành phần trên, hệ thống còn tích hợp thành phần AI hỗ trợ mua bán hàng. Thành phần này hoạt động thông qua OpenAI API, sử dụng các mô hình GPT để xử lý yêu cầu ngôn ngữ tự nhiên và trả kết quả về backend. AI không thay thế hoàn toàn nghiệp vụ bán hàng, mà đóng vai trò hỗ trợ tư vấn, giải thích thông tin sản phẩm và gợi ý lựa chọn dựa trên dữ liệu có sẵn trong hệ thống.</w:t>
       </w:r>
     </w:p>
     <w:p>
       <w:pPr>
         <w:pStyle w:val="Heading3"/>
-        <w:spacing w:before="0" w:after="120" w:line="312" w:lineRule="auto"/>
-      </w:pPr>
-      <w:bookmarkStart w:id="16" w:name="_Toc228292411"/>
+        <w:spacing w:before="60" w:after="120" w:line="312" w:lineRule="auto"/>
+        <w:rPr>
+          <w:rFonts w:ascii="Times New Roman" w:hAnsi="Times New Roman" w:cs="Times New Roman"/>
+        </w:rPr>
+      </w:pPr>
+      <w:bookmarkStart w:id="15" w:name="_Toc229000281"/>
       <w:r>
         <w:rPr>
-          <w:rFonts w:ascii="Times New Roman" w:eastAsia="Times New Roman" w:hAnsi="Times New Roman"/>
+          <w:rFonts w:ascii="Times New Roman" w:eastAsia="Times New Roman" w:hAnsi="Times New Roman" w:cs="Times New Roman"/>
+        </w:rPr>
+        <w:t>1.3.1. Ngôn ngữ JavaScript và TypeScript</w:t>
+      </w:r>
+      <w:bookmarkEnd w:id="15"/>
+    </w:p>
+    <w:p>
+      <w:pPr>
+        <w:spacing w:after="120" w:line="312" w:lineRule="auto"/>
+        <w:ind w:firstLine="720"/>
+        <w:jc w:val="both"/>
+      </w:pPr>
+      <w:r>
+        <w:t>JavaScript là ngôn ngữ lập trình được Brendan Eich tạo ra tại Netscape vào năm 1995, ban đầu nhằm bổ sung khả năng tương tác cho các trang web. Sau đó, JavaScript được chuẩn hóa theo đặc tả ECMAScript, giúp ngôn ngữ này phát triển ổn định và được hỗ trợ rộng rãi trên các trình duyệt. Một số mốc phát triển quan trọng có thể kể đến như ECMAScript 5 với nhiều cải tiến về xử lý đối tượng và mảng, ECMAScript 2015 với các cú pháp hiện đại như let, const, class, module, arrow function, promise, sau đó tiếp tục được cập nhật hằng năm để đáp ứng nhu cầu phát triển ứng dụng web hiện đại.</w:t>
+      </w:r>
+    </w:p>
+    <w:p>
+      <w:pPr>
+        <w:spacing w:after="120" w:line="312" w:lineRule="auto"/>
+        <w:ind w:firstLine="720"/>
+        <w:jc w:val="both"/>
+      </w:pPr>
+      <w:r>
+        <w:lastRenderedPageBreak/>
+        <w:t>TypeScript là ngôn ngữ do Microsoft giới thiệu vào năm 2012, được xây dựng như một phần mở rộng của JavaScript. Điểm nổi bật của TypeScript là bổ sung hệ thống kiểu dữ liệu tĩnh, interface, generic và khả năng kiểm tra lỗi trong quá trình phát triển. Mã TypeScript sau khi biên dịch vẫn trở thành JavaScript để chạy trên trình duyệt hoặc môi trường Node.js. Trong đề tài này, JavaScript và TypeScript phù hợp để xây dựng cả frontend bằng Next.js và backend bằng NestJS, giúp mã nguồn rõ ràng, dễ bảo trì và hạn chế lỗi khi hệ thống mở rộng.</w:t>
+      </w:r>
+    </w:p>
+    <w:p>
+      <w:pPr>
+        <w:pStyle w:val="Heading3"/>
+        <w:spacing w:before="60" w:after="120" w:line="312" w:lineRule="auto"/>
+        <w:rPr>
+          <w:rFonts w:ascii="Times New Roman" w:hAnsi="Times New Roman" w:cs="Times New Roman"/>
+        </w:rPr>
+      </w:pPr>
+      <w:bookmarkStart w:id="16" w:name="_Toc229000282"/>
+      <w:r>
+        <w:rPr>
+          <w:rFonts w:ascii="Times New Roman" w:eastAsia="Times New Roman" w:hAnsi="Times New Roman" w:cs="Times New Roman"/>
         </w:rPr>
         <w:t>1.3.2. Công nghệ Next.js cho giao diện người dùng</w:t>
       </w:r>
@@ -3150,7 +3254,7 @@
         <w:jc w:val="both"/>
       </w:pPr>
       <w:r>
-        <w:t>Next.js là framework phát triển ứng dụng web dựa trên React, phù hợp để xây dựng giao diện người dùng cho website thương mại điện tử. Next.js hỗ trợ tổ chức trang, điều hướng, tối ưu hiệu năng hiển thị và xây dựng các giao diện có tính tương tác cao. Đối với website bán máy tính, Next.js có thể được sử dụng để xây dựng trang chủ, danh sách sản phẩm, trang chi tiết sản phẩm, giỏ hàng, thanh toán, lịch sử mua hàng, trang tài khoản và giao diện trợ lý AI.</w:t>
+        <w:t>Next.js là framework phát triển ứng dụng web dựa trên React, được giới thiệu lần đầu bởi Vercel, trước đây là Zeit, vào năm 2016. Ban đầu, Next.js tập trung giải quyết bài toán render phía máy chủ cho ứng dụng React, giúp cải thiện tốc độ tải trang và khả năng tối ưu công cụ tìm kiếm. Qua các phiên bản phát triển, Next.js bổ sung nhiều khả năng quan trọng như tạo trang tĩnh, định tuyến theo cấu trúc thư mục, API routes, tối ưu hình ảnh, middleware, App Router và hỗ trợ React Server Components.</w:t>
       </w:r>
     </w:p>
     <w:p>
@@ -3160,19 +3264,21 @@
         <w:jc w:val="both"/>
       </w:pPr>
       <w:r>
-        <w:lastRenderedPageBreak/>
-        <w:t>Ưu điểm của Next.js là khả năng tổ chức mã nguồn rõ ràng, hỗ trợ tái sử dụng component và phù hợp với các ứng dụng cần tối ưu trải nghiệm người dùng. Các thành phần giao diện như thẻ sản phẩm, bộ lọc, thanh tìm kiếm, bảng so sánh cấu hình, giỏ hàng và form đặt hàng có thể được xây dựng thành các component độc lập. Điều này giúp quá trình phát triển dễ bảo trì hơn khi số lượng màn hình tăng lên.</w:t>
+        <w:t>Đối với website bán máy tính, Next.js có thể được sử dụng để xây dựng trang chủ, danh sách sản phẩm, trang chi tiết sản phẩm, giỏ hàng, thanh toán, lịch sử mua hàng, trang tài khoản và giao diện trợ lý AI. Các thành phần giao diện như thẻ sản phẩm, bộ lọc, thanh tìm kiếm, bảng so sánh cấu hình, giỏ hàng và form đặt hàng có thể được xây dựng thành các component độc lập. Cách tổ chức này giúp giao diện dễ mở rộng, dễ tái sử dụng và phù hợp với yêu cầu của một hệ thống thương mại điện tử.</w:t>
       </w:r>
     </w:p>
     <w:p>
       <w:pPr>
         <w:pStyle w:val="Heading3"/>
-        <w:spacing w:before="0" w:after="120" w:line="312" w:lineRule="auto"/>
-      </w:pPr>
-      <w:bookmarkStart w:id="17" w:name="_Toc228292412"/>
+        <w:spacing w:before="60" w:after="120" w:line="312" w:lineRule="auto"/>
+        <w:rPr>
+          <w:rFonts w:ascii="Times New Roman" w:hAnsi="Times New Roman" w:cs="Times New Roman"/>
+        </w:rPr>
+      </w:pPr>
+      <w:bookmarkStart w:id="17" w:name="_Toc229000283"/>
       <w:r>
         <w:rPr>
-          <w:rFonts w:ascii="Times New Roman" w:eastAsia="Times New Roman" w:hAnsi="Times New Roman"/>
+          <w:rFonts w:ascii="Times New Roman" w:eastAsia="Times New Roman" w:hAnsi="Times New Roman" w:cs="Times New Roman"/>
         </w:rPr>
         <w:t>1.3.3. Công nghệ NestJS cho backend</w:t>
       </w:r>
@@ -3185,7 +3291,7 @@
         <w:jc w:val="both"/>
       </w:pPr>
       <w:r>
-        <w:t>NestJS là framework backend chạy trên nền Node.js, được thiết kế theo kiến trúc module, controller và service. Cấu trúc này phù hợp với hệ thống thương mại điện tử vì mỗi nhóm chức năng có thể được tổ chức thành một module riêng như người dùng, xác thực, sản phẩm, danh mục, giỏ hàng, đơn hàng, thanh toán, đánh giá, báo cáo và AI. Việc phân tách module giúp mã nguồn rõ ràng và thuận lợi cho kiểm thử, bảo trì.</w:t>
+        <w:t>NestJS là framework backend chạy trên nền Node.js, được Kamil Myśliwiec giới thiệu vào khoảng năm 2017. Framework này chịu ảnh hưởng mạnh từ kiến trúc của Angular, sử dụng TypeScript làm ngôn ngữ chính và tổ chức mã nguồn theo các thành phần module, controller, service. Qua các phiên bản phát triển, NestJS mở rộng khả năng hỗ trợ nhiều loại ứng dụng backend như REST API, GraphQL, WebSocket, microservices, xác thực, kiểm thử và tích hợp với nhiều hệ quản trị cơ sở dữ liệu.</w:t>
       </w:r>
     </w:p>
     <w:p>
@@ -3195,18 +3301,22 @@
         <w:jc w:val="both"/>
       </w:pPr>
       <w:r>
-        <w:t>Trong hệ thống GTech, NestJS có thể đảm nhiệm vai trò xây dựng API cho frontend, xử lý nghiệp vụ, kiểm tra quyền truy cập, kết nối cơ sở dữ liệu và tích hợp với thành phần AI. Backend cũng là nơi kiểm soát các quy tắc quan trọng như kiểm tra tồn kho trước khi đặt hàng, tính tổng tiền đơn hàng, cập nhật trạng thái đơn, lưu lịch sử giao dịch và ghi nhận đánh giá sản phẩm.</w:t>
+        <w:lastRenderedPageBreak/>
+        <w:t>Trong hệ thống GTech, NestJS đảm nhiệm vai trò xây dựng API cho frontend, xử lý nghiệp vụ, kiểm tra quyền truy cập, kết nối cơ sở dữ liệu và tích hợp với thành phần AI. Backend cũng là nơi kiểm soát các quy tắc quan trọng như kiểm tra tồn kho trước khi đặt hàng, tính tổng tiền đơn hàng, cập nhật trạng thái đơn, lưu lịch sử giao dịch và ghi nhận đánh giá sản phẩm. Cấu trúc module của NestJS giúp tách riêng các nhóm chức năng như người dùng, sản phẩm, giỏ hàng, đơn hàng, thanh toán, báo cáo và AI.</w:t>
       </w:r>
     </w:p>
     <w:p>
       <w:pPr>
         <w:pStyle w:val="Heading3"/>
-        <w:spacing w:before="0" w:after="120" w:line="312" w:lineRule="auto"/>
-      </w:pPr>
-      <w:bookmarkStart w:id="18" w:name="_Toc228292413"/>
+        <w:spacing w:before="60" w:after="120" w:line="312" w:lineRule="auto"/>
+        <w:rPr>
+          <w:rFonts w:ascii="Times New Roman" w:hAnsi="Times New Roman" w:cs="Times New Roman"/>
+        </w:rPr>
+      </w:pPr>
+      <w:bookmarkStart w:id="18" w:name="_Toc229000284"/>
       <w:r>
         <w:rPr>
-          <w:rFonts w:ascii="Times New Roman" w:eastAsia="Times New Roman" w:hAnsi="Times New Roman"/>
+          <w:rFonts w:ascii="Times New Roman" w:eastAsia="Times New Roman" w:hAnsi="Times New Roman" w:cs="Times New Roman"/>
         </w:rPr>
         <w:t>1.3.4. Cơ sở dữ liệu PostgreSQL hoặc MySQL</w:t>
       </w:r>
@@ -3219,7 +3329,7 @@
         <w:jc w:val="both"/>
       </w:pPr>
       <w:r>
-        <w:t>Cơ sở dữ liệu quan hệ như PostgreSQL hoặc MySQL phù hợp với hệ thống bán hàng vì dữ liệu có nhiều quan hệ rõ ràng giữa người dùng, sản phẩm, danh mục, đơn hàng, chi tiết đơn hàng, thanh toán và đánh giá. Việc sử dụng cơ sở dữ liệu quan hệ giúp đảm bảo tính nhất quán của dữ liệu, hỗ trợ truy vấn báo cáo và thuận lợi cho việc thiết kế lược đồ dữ liệu ở các chương sau.</w:t>
+        <w:t>PostgreSQL có nguồn gốc từ dự án POSTGRES tại Đại học California, Berkeley vào thập niên 1980, sau đó phát triển thành hệ quản trị cơ sở dữ liệu quan hệ mã nguồn mở hỗ trợ SQL và nhiều tính năng nâng cao. MySQL được phát triển từ giữa thập niên 1990 và trở thành một trong những hệ quản trị cơ sở dữ liệu phổ biến cho các ứng dụng web. Cả PostgreSQL và MySQL đều có nhiều phiên bản phát triển qua thời gian, liên tục bổ sung khả năng tối ưu truy vấn, giao dịch, chỉ mục, bảo mật, sao lưu và nhân bản dữ liệu.</w:t>
       </w:r>
     </w:p>
     <w:p>
@@ -3229,20 +3339,22 @@
         <w:jc w:val="both"/>
       </w:pPr>
       <w:r>
-        <w:t>Đối với website bán máy tính, cơ sở dữ liệu cần lưu trữ thông tin sản phẩm ở mức chi tiết, bao gồm thương hiệu, danh mục, cấu hình, giá bán, tồn kho, hình ảnh, mô tả, trạng thái kinh doanh và các biến thể sản phẩm. Ngoài ra, hệ thống cần lưu thông tin khách hàng, địa chỉ giao hàng, đơn hàng, lịch sử thanh toán, đánh giá sản phẩm và lịch sử tương tác với AI để phục vụ chăm sóc khách hàng và thống kê.</w:t>
+        <w:t>Đối với website bán máy tính, cơ sở dữ liệu quan hệ phù hợp vì dữ liệu có nhiều mối liên kết rõ ràng giữa người dùng, vai trò, danh mục, thương hiệu, sản phẩm, biến thể sản phẩm, giỏ hàng, đơn hàng, chi tiết đơn hàng, thanh toán và đánh giá. Việc sử dụng cơ sở dữ liệu quan hệ giúp đảm bảo tính nhất quán của dữ liệu, hỗ trợ truy vấn báo cáo và thuận lợi cho việc thiết kế lược đồ dữ liệu ở các chương sau.</w:t>
       </w:r>
     </w:p>
     <w:p>
       <w:pPr>
         <w:pStyle w:val="Heading3"/>
-        <w:spacing w:before="0" w:after="120" w:line="312" w:lineRule="auto"/>
-      </w:pPr>
-      <w:bookmarkStart w:id="19" w:name="_Toc228292414"/>
+        <w:spacing w:before="60" w:after="120" w:line="312" w:lineRule="auto"/>
+        <w:rPr>
+          <w:rFonts w:ascii="Times New Roman" w:hAnsi="Times New Roman" w:cs="Times New Roman"/>
+        </w:rPr>
+      </w:pPr>
+      <w:bookmarkStart w:id="19" w:name="_Toc229000285"/>
       <w:r>
         <w:rPr>
-          <w:rFonts w:ascii="Times New Roman" w:eastAsia="Times New Roman" w:hAnsi="Times New Roman"/>
+          <w:rFonts w:ascii="Times New Roman" w:eastAsia="Times New Roman" w:hAnsi="Times New Roman" w:cs="Times New Roman"/>
         </w:rPr>
-        <w:lastRenderedPageBreak/>
         <w:t>1.3.5. OpenAI API, mô hình GPT và AI Agent</w:t>
       </w:r>
       <w:bookmarkEnd w:id="19"/>
@@ -3254,7 +3366,7 @@
         <w:jc w:val="both"/>
       </w:pPr>
       <w:r>
-        <w:t>OpenAI API là nền tảng lập trình cho phép ứng dụng kết nối đến các mô hình GPT của OpenAI, là nhóm mô hình ngôn ngữ lớn có khả năng hiểu và sinh văn bản tự nhiên, đồng thời là nền tảng công nghệ được ứng dụng trong sản phẩm ChatGPT. Trong phạm vi đề tài, hệ thống dự kiến sử dụng OpenAI API từ backend để xây dựng chức năng trợ lý AI, hỗ trợ khách hàng tư vấn sản phẩm, giải thích thông số kỹ thuật, so sánh cấu hình và trả lời các câu hỏi thường gặp. Cách tiếp cận này giúp rút ngắn thời gian phát triển, giảm yêu cầu triển khai hạ tầng AI riêng và phù hợp với phạm vi đồ án tốt nghiệp.</w:t>
+        <w:t>OpenAI API là nền tảng lập trình cho phép ứng dụng kết nối đến các mô hình GPT của OpenAI, nhóm mô hình ngôn ngữ lớn có khả năng hiểu và sinh văn bản tự nhiên, đồng thời là nền tảng công nghệ được ứng dụng trong sản phẩm ChatGPT. Dòng mô hình GPT đã phát triển qua nhiều thế hệ, từ các mô hình ngôn ngữ ban đầu đến các mô hình có khả năng hội thoại, suy luận, tóm tắt, phân tích ngữ cảnh và hỗ trợ tạo nội dung. Trong phạm vi đề tài, hệ thống dự kiến sử dụng OpenAI API từ backend để xây dựng chức năng trợ lý AI.</w:t>
       </w:r>
     </w:p>
     <w:p>
@@ -3264,28 +3376,25 @@
         <w:jc w:val="both"/>
       </w:pPr>
       <w:r>
-        <w:t>AI Agent được hiểu là tác tử AI có khả năng tiếp nhận yêu cầu, phân tích ngữ cảnh, gọi OpenAI API, sử dụng dữ liệu sản phẩm trong hệ thống và tạo phản hồi cho người dùng. Trong hệ thống GTech, AI Agent có thể nhận câu hỏi như “Tôi cần laptop học lập trình dưới 20 triệu” hoặc “Máy nào phù hợp để thiết kế đồ họa cơ bản”, sau đó truy vấn dữ liệu sản phẩm, lọc theo ngân sách và đề xuất một số lựa chọn phù hợp. AI Agent cũng có thể hỗ trợ quản trị viên tra cứu nhanh thông tin như sản phẩm bán chạy hoặc đơn hàng cần xử lý.</w:t>
+        <w:t xml:space="preserve">AI Agent được hiểu là tác tử AI có khả năng tiếp nhận yêu cầu, phân tích ngữ cảnh, gọi OpenAI API, sử dụng dữ liệu sản phẩm trong hệ thống và </w:t>
+      </w:r>
+      <w:r>
+        <w:lastRenderedPageBreak/>
+        <w:t>tạo phản hồi cho người dùng. Trong hệ thống GTech, AI Agent có thể nhận câu hỏi như “Tôi cần laptop học lập trình dưới 20 triệu” hoặc “Máy nào phù hợp để thiết kế đồ họa cơ bản”, sau đó truy vấn dữ liệu sản phẩm, lọc theo ngân sách và đề xuất một số lựa chọn phù hợp. Tuy nhiên, phản hồi của AI phải dựa trên dữ liệu sản phẩm thực tế, tránh đưa ra thông tin không tồn tại hoặc không đúng tồn kho.</w:t>
       </w:r>
     </w:p>
     <w:p>
       <w:pPr>
-        <w:spacing w:after="120" w:line="312" w:lineRule="auto"/>
-        <w:ind w:firstLine="720"/>
-        <w:jc w:val="both"/>
-      </w:pPr>
-      <w:r>
-        <w:t>Tuy nhiên, việc tích hợp AI cần được thiết kế thận trọng. Phản hồi của AI phải dựa trên dữ liệu sản phẩm thực tế trong hệ thống, tránh đưa ra thông tin không tồn tại hoặc không đúng tồn kho. Các tác vụ có tác động trực tiếp đến dữ liệu như cập nhật giá, xóa sản phẩm, xác nhận thanh toán hoặc hủy đơn hàng cần yêu cầu xác nhận của người có quyền quản trị. Đây là nguyên tắc quan trọng để AI đóng vai trò hỗ trợ thay vì gây rủi ro cho vận hành.</w:t>
-      </w:r>
-    </w:p>
-    <w:p>
-      <w:pPr>
         <w:pStyle w:val="Heading3"/>
-        <w:spacing w:before="0" w:after="120" w:line="312" w:lineRule="auto"/>
-      </w:pPr>
-      <w:bookmarkStart w:id="20" w:name="_Toc228292415"/>
+        <w:spacing w:before="60" w:after="120" w:line="312" w:lineRule="auto"/>
+        <w:rPr>
+          <w:rFonts w:ascii="Times New Roman" w:hAnsi="Times New Roman" w:cs="Times New Roman"/>
+        </w:rPr>
+      </w:pPr>
+      <w:bookmarkStart w:id="20" w:name="_Toc229000286"/>
       <w:r>
         <w:rPr>
-          <w:rFonts w:ascii="Times New Roman" w:eastAsia="Times New Roman" w:hAnsi="Times New Roman"/>
+          <w:rFonts w:ascii="Times New Roman" w:eastAsia="Times New Roman" w:hAnsi="Times New Roman" w:cs="Times New Roman"/>
         </w:rPr>
         <w:t>1.3.6. Công cụ phát triển và quản lý mã nguồn</w:t>
       </w:r>
@@ -3298,7 +3407,7 @@
         <w:jc w:val="both"/>
       </w:pPr>
       <w:r>
-        <w:t>Trong quá trình thực hiện đề tài, Visual Studio Code có thể được sử dụng làm môi trường phát triển chính. Git và GitHub được sử dụng để quản lý mã nguồn, lưu trữ tiến độ theo từng tuần và hỗ trợ việc theo dõi thay đổi trong quá trình làm đồ án. Việc đưa báo cáo, mã nguồn và tài liệu liên quan lên GitHub giúp giảng viên hướng dẫn dễ theo dõi tiến độ, đồng thời giúp sinh viên quản lý lịch sử phát triển sản phẩm rõ ràng hơn.</w:t>
+        <w:t>Visual Studio Code được sử dụng làm môi trường phát triển chính vì hỗ trợ tốt JavaScript, TypeScript, Next.js, NestJS và nhiều tiện ích mở rộng phục vụ lập trình web. Git được sử dụng để quản lý phiên bản mã nguồn, giúp ghi nhận lịch sử thay đổi, khôi phục các phiên bản cũ khi cần và phối hợp phát triển theo từng giai đoạn. GitHub được sử dụng để lưu trữ mã nguồn, báo cáo và tài liệu liên quan đến đồ án.</w:t>
       </w:r>
     </w:p>
     <w:p>
@@ -3308,22 +3417,21 @@
         <w:jc w:val="both"/>
       </w:pPr>
       <w:r>
-        <w:t xml:space="preserve">Theo yêu cầu thực hiện đồ án, sinh viên cần tạo repository GitHub và cập nhật nội dung báo cáo theo từng tuần. Cách làm này phù hợp với quy </w:t>
-      </w:r>
-      <w:r>
-        <w:lastRenderedPageBreak/>
-        <w:t>trình phát triển phần mềm vì mỗi giai đoạn như hoàn thiện chương 1, phân tích use case, thiết kế cơ sở dữ liệu, xây dựng frontend, xây dựng backend, tích hợp AI và kiểm thử đều có thể được ghi nhận bằng các lần cập nhật mã nguồn hoặc tài liệu.</w:t>
+        <w:t>Theo yêu cầu thực hiện đồ án, sinh viên cần tạo repository GitHub và cập nhật nội dung báo cáo theo từng tuần. Cách làm này phù hợp với quy trình phát triển phần mềm vì mỗi giai đoạn như hoàn thiện chương 1, phân tích use case, thiết kế cơ sở dữ liệu, xây dựng frontend, xây dựng backend, tích hợp AI và kiểm thử đều có thể được ghi nhận bằng các lần cập nhật mã nguồn hoặc tài liệu.</w:t>
       </w:r>
     </w:p>
     <w:p>
       <w:pPr>
-        <w:pStyle w:val="Heading3"/>
-        <w:spacing w:before="0" w:after="120" w:line="312" w:lineRule="auto"/>
-      </w:pPr>
-      <w:bookmarkStart w:id="21" w:name="_Toc228292416"/>
+        <w:pStyle w:val="Heading2"/>
+        <w:spacing w:before="60" w:after="120" w:line="312" w:lineRule="auto"/>
+        <w:rPr>
+          <w:rFonts w:ascii="Times New Roman" w:hAnsi="Times New Roman" w:cs="Times New Roman"/>
+        </w:rPr>
+      </w:pPr>
+      <w:bookmarkStart w:id="21" w:name="_Toc229000287"/>
       <w:r>
         <w:rPr>
-          <w:rFonts w:ascii="Times New Roman" w:eastAsia="Times New Roman" w:hAnsi="Times New Roman"/>
+          <w:rFonts w:ascii="Times New Roman" w:eastAsia="Times New Roman" w:hAnsi="Times New Roman" w:cs="Times New Roman"/>
         </w:rPr>
         <w:t>1.4. Kết luận chương 1</w:t>
       </w:r>
@@ -3346,7 +3454,11 @@
         <w:jc w:val="both"/>
       </w:pPr>
       <w:r>
-        <w:t>Chương này cũng đã xác định hiện trạng, các vấn đề cần giải quyết, nhóm người dùng liên quan, yêu cầu chính của hệ thống và các công nghệ dự kiến sử dụng như Next.js, NestJS, cơ sở dữ liệu quan hệ, OpenAI API, mô hình GPT, AI Agent, Git và GitHub. Đây là cơ sở để triển khai Chương 2 về phân tích và thiết kế hệ thống, bao gồm xác định tác nhân, xây dựng use case, thiết kế cơ sở dữ liệu, thiết kế lớp và thiết kế giao diện cho hệ thống website bán máy tính GTech có tích hợp AI hỗ trợ hoạt động mua bán hàng.</w:t>
+        <w:t xml:space="preserve">Chương này cũng đã xác định hiện trạng, các vấn đề cần giải quyết, nhóm người dùng liên quan, yêu cầu chính của hệ thống và các công nghệ dự kiến sử dụng như JavaScript, TypeScript, Next.js, NestJS, cơ sở dữ liệu quan hệ, OpenAI API, mô hình GPT, AI Agent, Git và GitHub. Đây là cơ sở để triển khai Chương 2 về phân tích và thiết kế hệ thống, bao gồm xác định tác </w:t>
+      </w:r>
+      <w:r>
+        <w:lastRenderedPageBreak/>
+        <w:t>nhân, xây dựng use case, thiết kế cơ sở dữ liệu, thiết kế lớp và thiết kế giao diện cho hệ thống website bán máy tính GTech có tích hợp AI hỗ trợ hoạt động mua bán hàng.</w:t>
       </w:r>
     </w:p>
     <w:sectPr>
@@ -4136,7 +4248,6 @@
     </w:pPr>
     <w:rPr>
       <w:rFonts w:asciiTheme="majorHAnsi" w:eastAsiaTheme="majorEastAsia" w:hAnsiTheme="majorHAnsi" w:cstheme="majorBidi"/>
-      <w:b/>
       <w:bCs/>
       <w:i/>
       <w:iCs/>
@@ -15073,6 +15184,19 @@
       <w:color w:val="0000FF" w:themeColor="hyperlink"/>
       <w:u w:val="single"/>
     </w:rPr>
+  </w:style>
+  <w:style w:type="paragraph" w:styleId="TOC2">
+    <w:name w:val="toc 2"/>
+    <w:basedOn w:val="Normal"/>
+    <w:next w:val="Normal"/>
+    <w:autoRedefine/>
+    <w:uiPriority w:val="39"/>
+    <w:unhideWhenUsed/>
+    <w:rsid w:val="001836AE"/>
+    <w:pPr>
+      <w:spacing w:after="100"/>
+      <w:ind w:left="280"/>
+    </w:pPr>
   </w:style>
 </w:styles>
 </file>

</xml_diff>

<commit_message>
Adjust chapter 1 heading font hierarchy
</commit_message>
<xml_diff>
--- a/BaoCao/Tuan_02_Chuong_1/Chuong_1_Bao_cao_DATN_TranHuyHoang_2022603587_co_bia_muc_luc_openai_gpt.docx
+++ b/BaoCao/Tuan_02_Chuong_1/Chuong_1_Bao_cao_DATN_TranHuyHoang_2022603587_co_bia_muc_luc_openai_gpt.docx
@@ -167,7 +167,7 @@
       <w:r>
         <w:fldChar w:fldCharType="separate"/>
       </w:r>
-      <w:hyperlink w:anchor="_Toc229000266" w:history="1">
+      <w:hyperlink w:anchor="_Toc229001321" w:history="1">
         <w:r>
           <w:rPr>
             <w:rStyle w:val="Hyperlink"/>
@@ -195,7 +195,7 @@
             <w:noProof/>
             <w:webHidden/>
           </w:rPr>
-          <w:instrText xml:space="preserve"> PAGEREF _Toc229000266 \h </w:instrText>
+          <w:instrText xml:space="preserve"> PAGEREF _Toc229001321 \h </w:instrText>
         </w:r>
         <w:r>
           <w:rPr>
@@ -241,7 +241,7 @@
           <w14:ligatures w14:val="standardContextual"/>
         </w:rPr>
       </w:pPr>
-      <w:hyperlink w:anchor="_Toc229000267" w:history="1">
+      <w:hyperlink w:anchor="_Toc229001322" w:history="1">
         <w:r>
           <w:rPr>
             <w:rStyle w:val="Hyperlink"/>
@@ -269,7 +269,7 @@
             <w:noProof/>
             <w:webHidden/>
           </w:rPr>
-          <w:instrText xml:space="preserve"> PAGEREF _Toc229000267 \h </w:instrText>
+          <w:instrText xml:space="preserve"> PAGEREF _Toc229001322 \h </w:instrText>
         </w:r>
         <w:r>
           <w:rPr>
@@ -315,7 +315,7 @@
           <w14:ligatures w14:val="standardContextual"/>
         </w:rPr>
       </w:pPr>
-      <w:hyperlink w:anchor="_Toc229000268" w:history="1">
+      <w:hyperlink w:anchor="_Toc229001323" w:history="1">
         <w:r>
           <w:rPr>
             <w:rStyle w:val="Hyperlink"/>
@@ -343,7 +343,7 @@
             <w:noProof/>
             <w:webHidden/>
           </w:rPr>
-          <w:instrText xml:space="preserve"> PAGEREF _Toc229000268 \h </w:instrText>
+          <w:instrText xml:space="preserve"> PAGEREF _Toc229001323 \h </w:instrText>
         </w:r>
         <w:r>
           <w:rPr>
@@ -389,7 +389,7 @@
           <w14:ligatures w14:val="standardContextual"/>
         </w:rPr>
       </w:pPr>
-      <w:hyperlink w:anchor="_Toc229000269" w:history="1">
+      <w:hyperlink w:anchor="_Toc229001324" w:history="1">
         <w:r>
           <w:rPr>
             <w:rStyle w:val="Hyperlink"/>
@@ -417,7 +417,7 @@
             <w:noProof/>
             <w:webHidden/>
           </w:rPr>
-          <w:instrText xml:space="preserve"> PAGEREF _Toc229000269 \h </w:instrText>
+          <w:instrText xml:space="preserve"> PAGEREF _Toc229001324 \h </w:instrText>
         </w:r>
         <w:r>
           <w:rPr>
@@ -463,7 +463,7 @@
           <w14:ligatures w14:val="standardContextual"/>
         </w:rPr>
       </w:pPr>
-      <w:hyperlink w:anchor="_Toc229000270" w:history="1">
+      <w:hyperlink w:anchor="_Toc229001325" w:history="1">
         <w:r>
           <w:rPr>
             <w:rStyle w:val="Hyperlink"/>
@@ -491,7 +491,7 @@
             <w:noProof/>
             <w:webHidden/>
           </w:rPr>
-          <w:instrText xml:space="preserve"> PAGEREF _Toc229000270 \h </w:instrText>
+          <w:instrText xml:space="preserve"> PAGEREF _Toc229001325 \h </w:instrText>
         </w:r>
         <w:r>
           <w:rPr>
@@ -537,7 +537,7 @@
           <w14:ligatures w14:val="standardContextual"/>
         </w:rPr>
       </w:pPr>
-      <w:hyperlink w:anchor="_Toc229000271" w:history="1">
+      <w:hyperlink w:anchor="_Toc229001326" w:history="1">
         <w:r>
           <w:rPr>
             <w:rStyle w:val="Hyperlink"/>
@@ -565,7 +565,7 @@
             <w:noProof/>
             <w:webHidden/>
           </w:rPr>
-          <w:instrText xml:space="preserve"> PAGEREF _Toc229000271 \h </w:instrText>
+          <w:instrText xml:space="preserve"> PAGEREF _Toc229001326 \h </w:instrText>
         </w:r>
         <w:r>
           <w:rPr>
@@ -611,7 +611,7 @@
           <w14:ligatures w14:val="standardContextual"/>
         </w:rPr>
       </w:pPr>
-      <w:hyperlink w:anchor="_Toc229000272" w:history="1">
+      <w:hyperlink w:anchor="_Toc229001327" w:history="1">
         <w:r>
           <w:rPr>
             <w:rStyle w:val="Hyperlink"/>
@@ -639,7 +639,7 @@
             <w:noProof/>
             <w:webHidden/>
           </w:rPr>
-          <w:instrText xml:space="preserve"> PAGEREF _Toc229000272 \h </w:instrText>
+          <w:instrText xml:space="preserve"> PAGEREF _Toc229001327 \h </w:instrText>
         </w:r>
         <w:r>
           <w:rPr>
@@ -685,7 +685,7 @@
           <w14:ligatures w14:val="standardContextual"/>
         </w:rPr>
       </w:pPr>
-      <w:hyperlink w:anchor="_Toc229000273" w:history="1">
+      <w:hyperlink w:anchor="_Toc229001328" w:history="1">
         <w:r>
           <w:rPr>
             <w:rStyle w:val="Hyperlink"/>
@@ -713,7 +713,7 @@
             <w:noProof/>
             <w:webHidden/>
           </w:rPr>
-          <w:instrText xml:space="preserve"> PAGEREF _Toc229000273 \h </w:instrText>
+          <w:instrText xml:space="preserve"> PAGEREF _Toc229001328 \h </w:instrText>
         </w:r>
         <w:r>
           <w:rPr>
@@ -759,7 +759,7 @@
           <w14:ligatures w14:val="standardContextual"/>
         </w:rPr>
       </w:pPr>
-      <w:hyperlink w:anchor="_Toc229000274" w:history="1">
+      <w:hyperlink w:anchor="_Toc229001329" w:history="1">
         <w:r>
           <w:rPr>
             <w:rStyle w:val="Hyperlink"/>
@@ -787,7 +787,7 @@
             <w:noProof/>
             <w:webHidden/>
           </w:rPr>
-          <w:instrText xml:space="preserve"> PAGEREF _Toc229000274 \h </w:instrText>
+          <w:instrText xml:space="preserve"> PAGEREF _Toc229001329 \h </w:instrText>
         </w:r>
         <w:r>
           <w:rPr>
@@ -833,7 +833,7 @@
           <w14:ligatures w14:val="standardContextual"/>
         </w:rPr>
       </w:pPr>
-      <w:hyperlink w:anchor="_Toc229000275" w:history="1">
+      <w:hyperlink w:anchor="_Toc229001330" w:history="1">
         <w:r>
           <w:rPr>
             <w:rStyle w:val="Hyperlink"/>
@@ -861,7 +861,7 @@
             <w:noProof/>
             <w:webHidden/>
           </w:rPr>
-          <w:instrText xml:space="preserve"> PAGEREF _Toc229000275 \h </w:instrText>
+          <w:instrText xml:space="preserve"> PAGEREF _Toc229001330 \h </w:instrText>
         </w:r>
         <w:r>
           <w:rPr>
@@ -907,7 +907,7 @@
           <w14:ligatures w14:val="standardContextual"/>
         </w:rPr>
       </w:pPr>
-      <w:hyperlink w:anchor="_Toc229000276" w:history="1">
+      <w:hyperlink w:anchor="_Toc229001331" w:history="1">
         <w:r>
           <w:rPr>
             <w:rStyle w:val="Hyperlink"/>
@@ -935,7 +935,7 @@
             <w:noProof/>
             <w:webHidden/>
           </w:rPr>
-          <w:instrText xml:space="preserve"> PAGEREF _Toc229000276 \h </w:instrText>
+          <w:instrText xml:space="preserve"> PAGEREF _Toc229001331 \h </w:instrText>
         </w:r>
         <w:r>
           <w:rPr>
@@ -981,7 +981,7 @@
           <w14:ligatures w14:val="standardContextual"/>
         </w:rPr>
       </w:pPr>
-      <w:hyperlink w:anchor="_Toc229000277" w:history="1">
+      <w:hyperlink w:anchor="_Toc229001332" w:history="1">
         <w:r>
           <w:rPr>
             <w:rStyle w:val="Hyperlink"/>
@@ -1009,7 +1009,7 @@
             <w:noProof/>
             <w:webHidden/>
           </w:rPr>
-          <w:instrText xml:space="preserve"> PAGEREF _Toc229000277 \h </w:instrText>
+          <w:instrText xml:space="preserve"> PAGEREF _Toc229001332 \h </w:instrText>
         </w:r>
         <w:r>
           <w:rPr>
@@ -1055,7 +1055,7 @@
           <w14:ligatures w14:val="standardContextual"/>
         </w:rPr>
       </w:pPr>
-      <w:hyperlink w:anchor="_Toc229000278" w:history="1">
+      <w:hyperlink w:anchor="_Toc229001333" w:history="1">
         <w:r>
           <w:rPr>
             <w:rStyle w:val="Hyperlink"/>
@@ -1083,7 +1083,7 @@
             <w:noProof/>
             <w:webHidden/>
           </w:rPr>
-          <w:instrText xml:space="preserve"> PAGEREF _Toc229000278 \h </w:instrText>
+          <w:instrText xml:space="preserve"> PAGEREF _Toc229001333 \h </w:instrText>
         </w:r>
         <w:r>
           <w:rPr>
@@ -1129,7 +1129,7 @@
           <w14:ligatures w14:val="standardContextual"/>
         </w:rPr>
       </w:pPr>
-      <w:hyperlink w:anchor="_Toc229000279" w:history="1">
+      <w:hyperlink w:anchor="_Toc229001334" w:history="1">
         <w:r>
           <w:rPr>
             <w:rStyle w:val="Hyperlink"/>
@@ -1157,7 +1157,7 @@
             <w:noProof/>
             <w:webHidden/>
           </w:rPr>
-          <w:instrText xml:space="preserve"> PAGEREF _Toc229000279 \h </w:instrText>
+          <w:instrText xml:space="preserve"> PAGEREF _Toc229001334 \h </w:instrText>
         </w:r>
         <w:r>
           <w:rPr>
@@ -1203,7 +1203,7 @@
           <w14:ligatures w14:val="standardContextual"/>
         </w:rPr>
       </w:pPr>
-      <w:hyperlink w:anchor="_Toc229000280" w:history="1">
+      <w:hyperlink w:anchor="_Toc229001335" w:history="1">
         <w:r>
           <w:rPr>
             <w:rStyle w:val="Hyperlink"/>
@@ -1231,7 +1231,7 @@
             <w:noProof/>
             <w:webHidden/>
           </w:rPr>
-          <w:instrText xml:space="preserve"> PAGEREF _Toc229000280 \h </w:instrText>
+          <w:instrText xml:space="preserve"> PAGEREF _Toc229001335 \h </w:instrText>
         </w:r>
         <w:r>
           <w:rPr>
@@ -1277,7 +1277,7 @@
           <w14:ligatures w14:val="standardContextual"/>
         </w:rPr>
       </w:pPr>
-      <w:hyperlink w:anchor="_Toc229000281" w:history="1">
+      <w:hyperlink w:anchor="_Toc229001336" w:history="1">
         <w:r>
           <w:rPr>
             <w:rStyle w:val="Hyperlink"/>
@@ -1305,7 +1305,7 @@
             <w:noProof/>
             <w:webHidden/>
           </w:rPr>
-          <w:instrText xml:space="preserve"> PAGEREF _Toc229000281 \h </w:instrText>
+          <w:instrText xml:space="preserve"> PAGEREF _Toc229001336 \h </w:instrText>
         </w:r>
         <w:r>
           <w:rPr>
@@ -1351,7 +1351,7 @@
           <w14:ligatures w14:val="standardContextual"/>
         </w:rPr>
       </w:pPr>
-      <w:hyperlink w:anchor="_Toc229000282" w:history="1">
+      <w:hyperlink w:anchor="_Toc229001337" w:history="1">
         <w:r>
           <w:rPr>
             <w:rStyle w:val="Hyperlink"/>
@@ -1379,7 +1379,7 @@
             <w:noProof/>
             <w:webHidden/>
           </w:rPr>
-          <w:instrText xml:space="preserve"> PAGEREF _Toc229000282 \h </w:instrText>
+          <w:instrText xml:space="preserve"> PAGEREF _Toc229001337 \h </w:instrText>
         </w:r>
         <w:r>
           <w:rPr>
@@ -1425,7 +1425,7 @@
           <w14:ligatures w14:val="standardContextual"/>
         </w:rPr>
       </w:pPr>
-      <w:hyperlink w:anchor="_Toc229000283" w:history="1">
+      <w:hyperlink w:anchor="_Toc229001338" w:history="1">
         <w:r>
           <w:rPr>
             <w:rStyle w:val="Hyperlink"/>
@@ -1453,7 +1453,7 @@
             <w:noProof/>
             <w:webHidden/>
           </w:rPr>
-          <w:instrText xml:space="preserve"> PAGEREF _Toc229000283 \h </w:instrText>
+          <w:instrText xml:space="preserve"> PAGEREF _Toc229001338 \h </w:instrText>
         </w:r>
         <w:r>
           <w:rPr>
@@ -1499,7 +1499,7 @@
           <w14:ligatures w14:val="standardContextual"/>
         </w:rPr>
       </w:pPr>
-      <w:hyperlink w:anchor="_Toc229000284" w:history="1">
+      <w:hyperlink w:anchor="_Toc229001339" w:history="1">
         <w:r>
           <w:rPr>
             <w:rStyle w:val="Hyperlink"/>
@@ -1527,7 +1527,7 @@
             <w:noProof/>
             <w:webHidden/>
           </w:rPr>
-          <w:instrText xml:space="preserve"> PAGEREF _Toc229000284 \h </w:instrText>
+          <w:instrText xml:space="preserve"> PAGEREF _Toc229001339 \h </w:instrText>
         </w:r>
         <w:r>
           <w:rPr>
@@ -1573,7 +1573,7 @@
           <w14:ligatures w14:val="standardContextual"/>
         </w:rPr>
       </w:pPr>
-      <w:hyperlink w:anchor="_Toc229000285" w:history="1">
+      <w:hyperlink w:anchor="_Toc229001340" w:history="1">
         <w:r>
           <w:rPr>
             <w:rStyle w:val="Hyperlink"/>
@@ -1601,7 +1601,7 @@
             <w:noProof/>
             <w:webHidden/>
           </w:rPr>
-          <w:instrText xml:space="preserve"> PAGEREF _Toc229000285 \h </w:instrText>
+          <w:instrText xml:space="preserve"> PAGEREF _Toc229001340 \h </w:instrText>
         </w:r>
         <w:r>
           <w:rPr>
@@ -1647,7 +1647,7 @@
           <w14:ligatures w14:val="standardContextual"/>
         </w:rPr>
       </w:pPr>
-      <w:hyperlink w:anchor="_Toc229000286" w:history="1">
+      <w:hyperlink w:anchor="_Toc229001341" w:history="1">
         <w:r>
           <w:rPr>
             <w:rStyle w:val="Hyperlink"/>
@@ -1675,7 +1675,7 @@
             <w:noProof/>
             <w:webHidden/>
           </w:rPr>
-          <w:instrText xml:space="preserve"> PAGEREF _Toc229000286 \h </w:instrText>
+          <w:instrText xml:space="preserve"> PAGEREF _Toc229001341 \h </w:instrText>
         </w:r>
         <w:r>
           <w:rPr>
@@ -1721,7 +1721,7 @@
           <w14:ligatures w14:val="standardContextual"/>
         </w:rPr>
       </w:pPr>
-      <w:hyperlink w:anchor="_Toc229000287" w:history="1">
+      <w:hyperlink w:anchor="_Toc229001342" w:history="1">
         <w:r>
           <w:rPr>
             <w:rStyle w:val="Hyperlink"/>
@@ -1749,7 +1749,7 @@
             <w:noProof/>
             <w:webHidden/>
           </w:rPr>
-          <w:instrText xml:space="preserve"> PAGEREF _Toc229000287 \h </w:instrText>
+          <w:instrText xml:space="preserve"> PAGEREF _Toc229001342 \h </w:instrText>
         </w:r>
         <w:r>
           <w:rPr>
@@ -1802,7 +1802,7 @@
           <w:rFonts w:ascii="Times New Roman" w:hAnsi="Times New Roman" w:cs="Times New Roman"/>
         </w:rPr>
       </w:pPr>
-      <w:bookmarkStart w:id="0" w:name="_Toc229000266"/>
+      <w:bookmarkStart w:id="0" w:name="_Toc229001321"/>
       <w:r>
         <w:rPr>
           <w:rFonts w:ascii="Times New Roman" w:eastAsia="Times New Roman" w:hAnsi="Times New Roman" w:cs="Times New Roman"/>
@@ -1820,7 +1820,7 @@
           <w:rFonts w:ascii="Times New Roman" w:hAnsi="Times New Roman" w:cs="Times New Roman"/>
         </w:rPr>
       </w:pPr>
-      <w:bookmarkStart w:id="1" w:name="_Toc229000267"/>
+      <w:bookmarkStart w:id="1" w:name="_Toc229001322"/>
       <w:r>
         <w:rPr>
           <w:rFonts w:ascii="Times New Roman" w:eastAsia="Times New Roman" w:hAnsi="Times New Roman" w:cs="Times New Roman"/>
@@ -1835,12 +1835,14 @@
         <w:spacing w:before="60" w:after="120" w:line="312" w:lineRule="auto"/>
         <w:rPr>
           <w:rFonts w:ascii="Times New Roman" w:hAnsi="Times New Roman" w:cs="Times New Roman"/>
+          <w:sz w:val="26"/>
         </w:rPr>
       </w:pPr>
-      <w:bookmarkStart w:id="2" w:name="_Toc229000268"/>
+      <w:bookmarkStart w:id="2" w:name="_Toc229001323"/>
       <w:r>
         <w:rPr>
           <w:rFonts w:ascii="Times New Roman" w:eastAsia="Times New Roman" w:hAnsi="Times New Roman" w:cs="Times New Roman"/>
+          <w:sz w:val="26"/>
         </w:rPr>
         <w:t>1.1.1. Tổng quan về thương mại điện tử</w:t>
       </w:r>
@@ -1896,12 +1898,14 @@
         <w:spacing w:before="60" w:after="120" w:line="312" w:lineRule="auto"/>
         <w:rPr>
           <w:rFonts w:ascii="Times New Roman" w:hAnsi="Times New Roman" w:cs="Times New Roman"/>
+          <w:sz w:val="26"/>
         </w:rPr>
       </w:pPr>
-      <w:bookmarkStart w:id="3" w:name="_Toc229000269"/>
+      <w:bookmarkStart w:id="3" w:name="_Toc229001324"/>
       <w:r>
         <w:rPr>
           <w:rFonts w:ascii="Times New Roman" w:eastAsia="Times New Roman" w:hAnsi="Times New Roman" w:cs="Times New Roman"/>
+          <w:sz w:val="26"/>
         </w:rPr>
         <w:t>1.1.2. Đặc điểm của thương mại điện tử trong lĩnh vực máy tính và linh kiện</w:t>
       </w:r>
@@ -1944,11 +1948,11 @@
         <w:jc w:val="both"/>
       </w:pPr>
       <w:r>
-        <w:t xml:space="preserve">Trong bối cảnh đó, việc tích hợp trí tuệ nhân tạo vào website bán máy tính có ý nghĩa thực tiễn. AI có thể hỗ trợ khách hàng diễn đạt nhu cầu bằng ngôn ngữ tự nhiên, sau đó gợi ý nhóm sản phẩm hoặc cấu hình phù hợp. AI cũng có thể hỗ trợ so sánh sản phẩm, giải thích thông số kỹ thuật, tư vấn cấu hình theo ngân sách và trả lời các câu hỏi thường gặp về bảo hành, giao hàng </w:t>
+        <w:t xml:space="preserve">Trong bối cảnh đó, việc tích hợp trí tuệ nhân tạo vào website bán máy tính có ý nghĩa thực tiễn. AI có thể hỗ trợ khách hàng diễn đạt nhu cầu bằng ngôn ngữ tự nhiên, sau đó gợi ý nhóm sản phẩm hoặc cấu hình phù hợp. AI cũng có thể hỗ trợ so sánh sản phẩm, giải thích thông số kỹ thuật, tư vấn cấu hình theo ngân sách và trả lời các câu hỏi thường gặp về bảo hành, giao hàng hoặc chính sách mua bán. Đối với quản trị viên, AI có thể hỗ trợ tổng hợp dữ </w:t>
       </w:r>
       <w:r>
         <w:lastRenderedPageBreak/>
-        <w:t>hoặc chính sách mua bán. Đối với quản trị viên, AI có thể hỗ trợ tổng hợp dữ liệu bán hàng, phân tích xu hướng sản phẩm và gợi ý nội dung chăm sóc khách hàng.</w:t>
+        <w:t>liệu bán hàng, phân tích xu hướng sản phẩm và gợi ý nội dung chăm sóc khách hàng.</w:t>
       </w:r>
     </w:p>
     <w:p>
@@ -1957,12 +1961,14 @@
         <w:spacing w:before="60" w:after="120" w:line="312" w:lineRule="auto"/>
         <w:rPr>
           <w:rFonts w:ascii="Times New Roman" w:hAnsi="Times New Roman" w:cs="Times New Roman"/>
+          <w:sz w:val="26"/>
         </w:rPr>
       </w:pPr>
-      <w:bookmarkStart w:id="4" w:name="_Toc229000270"/>
+      <w:bookmarkStart w:id="4" w:name="_Toc229001325"/>
       <w:r>
         <w:rPr>
           <w:rFonts w:ascii="Times New Roman" w:eastAsia="Times New Roman" w:hAnsi="Times New Roman" w:cs="Times New Roman"/>
+          <w:sz w:val="26"/>
         </w:rPr>
         <w:t>1.1.3. Thuận lợi khi ứng dụng thương mại điện tử</w:t>
       </w:r>
@@ -2014,12 +2020,14 @@
         <w:spacing w:before="60" w:after="120" w:line="312" w:lineRule="auto"/>
         <w:rPr>
           <w:rFonts w:ascii="Times New Roman" w:hAnsi="Times New Roman" w:cs="Times New Roman"/>
+          <w:sz w:val="26"/>
         </w:rPr>
       </w:pPr>
-      <w:bookmarkStart w:id="5" w:name="_Toc229000271"/>
+      <w:bookmarkStart w:id="5" w:name="_Toc229001326"/>
       <w:r>
         <w:rPr>
           <w:rFonts w:ascii="Times New Roman" w:eastAsia="Times New Roman" w:hAnsi="Times New Roman" w:cs="Times New Roman"/>
+          <w:sz w:val="26"/>
         </w:rPr>
         <w:t>1.1.4. Khó khăn và thách thức khi triển khai thương mại điện tử</w:t>
       </w:r>
@@ -2032,11 +2040,11 @@
         <w:jc w:val="both"/>
       </w:pPr>
       <w:r>
-        <w:t xml:space="preserve">Bên cạnh các thuận lợi, việc triển khai thương mại điện tử cũng đặt ra nhiều khó khăn. Khó khăn đầu tiên là yêu cầu về chất lượng dữ liệu sản phẩm. </w:t>
+        <w:t xml:space="preserve">Bên cạnh các thuận lợi, việc triển khai thương mại điện tử cũng đặt ra nhiều khó khăn. Khó khăn đầu tiên là yêu cầu về chất lượng dữ liệu sản phẩm. Đối với sản phẩm công nghệ, nếu thông số kỹ thuật không đầy đủ, giá bán </w:t>
       </w:r>
       <w:r>
         <w:lastRenderedPageBreak/>
-        <w:t>Đối với sản phẩm công nghệ, nếu thông số kỹ thuật không đầy đủ, giá bán không được cập nhật hoặc hình ảnh không rõ ràng, khách hàng có thể mất niềm tin và chuyển sang lựa chọn nhà cung cấp khác. Vì vậy, doanh nghiệp cần có quy trình quản lý dữ liệu sản phẩm nhất quán.</w:t>
+        <w:t>không được cập nhật hoặc hình ảnh không rõ ràng, khách hàng có thể mất niềm tin và chuyển sang lựa chọn nhà cung cấp khác. Vì vậy, doanh nghiệp cần có quy trình quản lý dữ liệu sản phẩm nhất quán.</w:t>
       </w:r>
     </w:p>
     <w:p>
@@ -2075,12 +2083,14 @@
         <w:spacing w:before="60" w:after="120" w:line="312" w:lineRule="auto"/>
         <w:rPr>
           <w:rFonts w:ascii="Times New Roman" w:hAnsi="Times New Roman" w:cs="Times New Roman"/>
+          <w:sz w:val="26"/>
         </w:rPr>
       </w:pPr>
-      <w:bookmarkStart w:id="6" w:name="_Toc229000272"/>
+      <w:bookmarkStart w:id="6" w:name="_Toc229001327"/>
       <w:r>
         <w:rPr>
           <w:rFonts w:ascii="Times New Roman" w:eastAsia="Times New Roman" w:hAnsi="Times New Roman" w:cs="Times New Roman"/>
+          <w:sz w:val="26"/>
         </w:rPr>
         <w:t>1.1.5. Giới thiệu về công ty GTech và định hướng xây dựng website</w:t>
       </w:r>
@@ -2103,11 +2113,11 @@
         <w:jc w:val="both"/>
       </w:pPr>
       <w:r>
-        <w:t xml:space="preserve">Nếu hoạt động bán hàng của GTech chủ yếu dựa vào tư vấn trực tiếp và ghi nhận đơn hàng thủ công, doanh nghiệp sẽ gặp khó khăn khi số lượng sản </w:t>
+        <w:t xml:space="preserve">Nếu hoạt động bán hàng của GTech chủ yếu dựa vào tư vấn trực tiếp và ghi nhận đơn hàng thủ công, doanh nghiệp sẽ gặp khó khăn khi số lượng sản phẩm tăng, số lượng khách hàng lớn hơn hoặc nhu cầu theo dõi dữ liệu bán </w:t>
       </w:r>
       <w:r>
         <w:lastRenderedPageBreak/>
-        <w:t>phẩm tăng, số lượng khách hàng lớn hơn hoặc nhu cầu theo dõi dữ liệu bán hàng trở nên thường xuyên. Các vấn đề như cập nhật giá không đồng bộ, thiếu công cụ lọc sản phẩm theo cấu hình, thiếu lịch sử tương tác khách hàng và chưa có báo cáo doanh thu kịp thời có thể ảnh hưởng đến hiệu quả vận hành.</w:t>
+        <w:t>hàng trở nên thường xuyên. Các vấn đề như cập nhật giá không đồng bộ, thiếu công cụ lọc sản phẩm theo cấu hình, thiếu lịch sử tương tác khách hàng và chưa có báo cáo doanh thu kịp thời có thể ảnh hưởng đến hiệu quả vận hành.</w:t>
       </w:r>
     </w:p>
     <w:p>
@@ -2466,7 +2476,7 @@
           <w:rFonts w:ascii="Times New Roman" w:hAnsi="Times New Roman" w:cs="Times New Roman"/>
         </w:rPr>
       </w:pPr>
-      <w:bookmarkStart w:id="7" w:name="_Toc229000273"/>
+      <w:bookmarkStart w:id="7" w:name="_Toc229001328"/>
       <w:r>
         <w:rPr>
           <w:rFonts w:ascii="Times New Roman" w:eastAsia="Times New Roman" w:hAnsi="Times New Roman" w:cs="Times New Roman"/>
@@ -2482,12 +2492,14 @@
         <w:spacing w:before="60" w:after="120" w:line="312" w:lineRule="auto"/>
         <w:rPr>
           <w:rFonts w:ascii="Times New Roman" w:hAnsi="Times New Roman" w:cs="Times New Roman"/>
+          <w:sz w:val="26"/>
         </w:rPr>
       </w:pPr>
-      <w:bookmarkStart w:id="8" w:name="_Toc229000274"/>
+      <w:bookmarkStart w:id="8" w:name="_Toc229001329"/>
       <w:r>
         <w:rPr>
           <w:rFonts w:ascii="Times New Roman" w:eastAsia="Times New Roman" w:hAnsi="Times New Roman" w:cs="Times New Roman"/>
+          <w:sz w:val="26"/>
         </w:rPr>
         <w:t>1.2.1. Hiện trạng hoạt động kinh doanh của GTech</w:t>
       </w:r>
@@ -2529,12 +2541,14 @@
         <w:spacing w:before="60" w:after="120" w:line="312" w:lineRule="auto"/>
         <w:rPr>
           <w:rFonts w:ascii="Times New Roman" w:hAnsi="Times New Roman" w:cs="Times New Roman"/>
+          <w:sz w:val="26"/>
         </w:rPr>
       </w:pPr>
-      <w:bookmarkStart w:id="9" w:name="_Toc229000275"/>
+      <w:bookmarkStart w:id="9" w:name="_Toc229001330"/>
       <w:r>
         <w:rPr>
           <w:rFonts w:ascii="Times New Roman" w:eastAsia="Times New Roman" w:hAnsi="Times New Roman" w:cs="Times New Roman"/>
+          <w:sz w:val="26"/>
         </w:rPr>
         <w:t>1.2.2. Cơ cấu tổ chức liên quan đến hệ thống</w:t>
       </w:r>
@@ -2570,12 +2584,14 @@
         <w:spacing w:before="60" w:after="120" w:line="312" w:lineRule="auto"/>
         <w:rPr>
           <w:rFonts w:ascii="Times New Roman" w:hAnsi="Times New Roman" w:cs="Times New Roman"/>
+          <w:sz w:val="26"/>
         </w:rPr>
       </w:pPr>
-      <w:bookmarkStart w:id="10" w:name="_Toc229000276"/>
+      <w:bookmarkStart w:id="10" w:name="_Toc229001331"/>
       <w:r>
         <w:rPr>
           <w:rFonts w:ascii="Times New Roman" w:eastAsia="Times New Roman" w:hAnsi="Times New Roman" w:cs="Times New Roman"/>
+          <w:sz w:val="26"/>
         </w:rPr>
         <w:t>1.2.3. Mô tả hoạt động của các bộ phận</w:t>
       </w:r>
@@ -2627,12 +2643,14 @@
         <w:spacing w:before="60" w:after="120" w:line="312" w:lineRule="auto"/>
         <w:rPr>
           <w:rFonts w:ascii="Times New Roman" w:hAnsi="Times New Roman" w:cs="Times New Roman"/>
+          <w:sz w:val="26"/>
         </w:rPr>
       </w:pPr>
-      <w:bookmarkStart w:id="11" w:name="_Toc229000277"/>
+      <w:bookmarkStart w:id="11" w:name="_Toc229001332"/>
       <w:r>
         <w:rPr>
           <w:rFonts w:ascii="Times New Roman" w:eastAsia="Times New Roman" w:hAnsi="Times New Roman" w:cs="Times New Roman"/>
+          <w:sz w:val="26"/>
         </w:rPr>
         <w:t>1.2.4. Các vấn đề tồn tại</w:t>
       </w:r>
@@ -2678,12 +2696,14 @@
         <w:spacing w:before="60" w:after="120" w:line="312" w:lineRule="auto"/>
         <w:rPr>
           <w:rFonts w:ascii="Times New Roman" w:hAnsi="Times New Roman" w:cs="Times New Roman"/>
+          <w:sz w:val="26"/>
         </w:rPr>
       </w:pPr>
-      <w:bookmarkStart w:id="12" w:name="_Toc229000278"/>
+      <w:bookmarkStart w:id="12" w:name="_Toc229001333"/>
       <w:r>
         <w:rPr>
           <w:rFonts w:ascii="Times New Roman" w:eastAsia="Times New Roman" w:hAnsi="Times New Roman" w:cs="Times New Roman"/>
+          <w:sz w:val="26"/>
         </w:rPr>
         <w:t>1.2.5. Định hướng giải quyết</w:t>
       </w:r>
@@ -2739,12 +2759,14 @@
         <w:spacing w:before="60" w:after="120" w:line="312" w:lineRule="auto"/>
         <w:rPr>
           <w:rFonts w:ascii="Times New Roman" w:hAnsi="Times New Roman" w:cs="Times New Roman"/>
+          <w:sz w:val="26"/>
         </w:rPr>
       </w:pPr>
-      <w:bookmarkStart w:id="13" w:name="_Toc229000279"/>
+      <w:bookmarkStart w:id="13" w:name="_Toc229001334"/>
       <w:r>
         <w:rPr>
           <w:rFonts w:ascii="Times New Roman" w:eastAsia="Times New Roman" w:hAnsi="Times New Roman" w:cs="Times New Roman"/>
+          <w:sz w:val="26"/>
         </w:rPr>
         <w:t>1.2.6. Xác định yêu cầu hệ thống</w:t>
       </w:r>
@@ -3163,7 +3185,7 @@
           <w:rFonts w:ascii="Times New Roman" w:hAnsi="Times New Roman" w:cs="Times New Roman"/>
         </w:rPr>
       </w:pPr>
-      <w:bookmarkStart w:id="14" w:name="_Toc229000280"/>
+      <w:bookmarkStart w:id="14" w:name="_Toc229001335"/>
       <w:r>
         <w:rPr>
           <w:rFonts w:ascii="Times New Roman" w:eastAsia="Times New Roman" w:hAnsi="Times New Roman" w:cs="Times New Roman"/>
@@ -3198,12 +3220,14 @@
         <w:spacing w:before="60" w:after="120" w:line="312" w:lineRule="auto"/>
         <w:rPr>
           <w:rFonts w:ascii="Times New Roman" w:hAnsi="Times New Roman" w:cs="Times New Roman"/>
+          <w:sz w:val="26"/>
         </w:rPr>
       </w:pPr>
-      <w:bookmarkStart w:id="15" w:name="_Toc229000281"/>
+      <w:bookmarkStart w:id="15" w:name="_Toc229001336"/>
       <w:r>
         <w:rPr>
           <w:rFonts w:ascii="Times New Roman" w:eastAsia="Times New Roman" w:hAnsi="Times New Roman" w:cs="Times New Roman"/>
+          <w:sz w:val="26"/>
         </w:rPr>
         <w:t>1.3.1. Ngôn ngữ JavaScript và TypeScript</w:t>
       </w:r>
@@ -3236,12 +3260,14 @@
         <w:spacing w:before="60" w:after="120" w:line="312" w:lineRule="auto"/>
         <w:rPr>
           <w:rFonts w:ascii="Times New Roman" w:hAnsi="Times New Roman" w:cs="Times New Roman"/>
+          <w:sz w:val="26"/>
         </w:rPr>
       </w:pPr>
-      <w:bookmarkStart w:id="16" w:name="_Toc229000282"/>
+      <w:bookmarkStart w:id="16" w:name="_Toc229001337"/>
       <w:r>
         <w:rPr>
           <w:rFonts w:ascii="Times New Roman" w:eastAsia="Times New Roman" w:hAnsi="Times New Roman" w:cs="Times New Roman"/>
+          <w:sz w:val="26"/>
         </w:rPr>
         <w:t>1.3.2. Công nghệ Next.js cho giao diện người dùng</w:t>
       </w:r>
@@ -3273,12 +3299,14 @@
         <w:spacing w:before="60" w:after="120" w:line="312" w:lineRule="auto"/>
         <w:rPr>
           <w:rFonts w:ascii="Times New Roman" w:hAnsi="Times New Roman" w:cs="Times New Roman"/>
+          <w:sz w:val="26"/>
         </w:rPr>
       </w:pPr>
-      <w:bookmarkStart w:id="17" w:name="_Toc229000283"/>
+      <w:bookmarkStart w:id="17" w:name="_Toc229001338"/>
       <w:r>
         <w:rPr>
           <w:rFonts w:ascii="Times New Roman" w:eastAsia="Times New Roman" w:hAnsi="Times New Roman" w:cs="Times New Roman"/>
+          <w:sz w:val="26"/>
         </w:rPr>
         <w:t>1.3.3. Công nghệ NestJS cho backend</w:t>
       </w:r>
@@ -3311,12 +3339,14 @@
         <w:spacing w:before="60" w:after="120" w:line="312" w:lineRule="auto"/>
         <w:rPr>
           <w:rFonts w:ascii="Times New Roman" w:hAnsi="Times New Roman" w:cs="Times New Roman"/>
+          <w:sz w:val="26"/>
         </w:rPr>
       </w:pPr>
-      <w:bookmarkStart w:id="18" w:name="_Toc229000284"/>
+      <w:bookmarkStart w:id="18" w:name="_Toc229001339"/>
       <w:r>
         <w:rPr>
           <w:rFonts w:ascii="Times New Roman" w:eastAsia="Times New Roman" w:hAnsi="Times New Roman" w:cs="Times New Roman"/>
+          <w:sz w:val="26"/>
         </w:rPr>
         <w:t>1.3.4. Cơ sở dữ liệu PostgreSQL hoặc MySQL</w:t>
       </w:r>
@@ -3348,12 +3378,14 @@
         <w:spacing w:before="60" w:after="120" w:line="312" w:lineRule="auto"/>
         <w:rPr>
           <w:rFonts w:ascii="Times New Roman" w:hAnsi="Times New Roman" w:cs="Times New Roman"/>
+          <w:sz w:val="26"/>
         </w:rPr>
       </w:pPr>
-      <w:bookmarkStart w:id="19" w:name="_Toc229000285"/>
+      <w:bookmarkStart w:id="19" w:name="_Toc229001340"/>
       <w:r>
         <w:rPr>
           <w:rFonts w:ascii="Times New Roman" w:eastAsia="Times New Roman" w:hAnsi="Times New Roman" w:cs="Times New Roman"/>
+          <w:sz w:val="26"/>
         </w:rPr>
         <w:t>1.3.5. OpenAI API, mô hình GPT và AI Agent</w:t>
       </w:r>
@@ -3389,12 +3421,14 @@
         <w:spacing w:before="60" w:after="120" w:line="312" w:lineRule="auto"/>
         <w:rPr>
           <w:rFonts w:ascii="Times New Roman" w:hAnsi="Times New Roman" w:cs="Times New Roman"/>
+          <w:sz w:val="26"/>
         </w:rPr>
       </w:pPr>
-      <w:bookmarkStart w:id="20" w:name="_Toc229000286"/>
+      <w:bookmarkStart w:id="20" w:name="_Toc229001341"/>
       <w:r>
         <w:rPr>
           <w:rFonts w:ascii="Times New Roman" w:eastAsia="Times New Roman" w:hAnsi="Times New Roman" w:cs="Times New Roman"/>
+          <w:sz w:val="26"/>
         </w:rPr>
         <w:t>1.3.6. Công cụ phát triển và quản lý mã nguồn</w:t>
       </w:r>
@@ -3428,7 +3462,7 @@
           <w:rFonts w:ascii="Times New Roman" w:hAnsi="Times New Roman" w:cs="Times New Roman"/>
         </w:rPr>
       </w:pPr>
-      <w:bookmarkStart w:id="21" w:name="_Toc229000287"/>
+      <w:bookmarkStart w:id="21" w:name="_Toc229001342"/>
       <w:r>
         <w:rPr>
           <w:rFonts w:ascii="Times New Roman" w:eastAsia="Times New Roman" w:hAnsi="Times New Roman" w:cs="Times New Roman"/>

</xml_diff>